<commit_message>
fix: add AI use declaration to Methods section (Wiley AIGC policy)
Add subsection 2.4 'Use of AI-Assisted Tools' at the end of Methods
(before 3. Results), per Wiley requirement that AIGC declaration must
appear within the Methods section. Lists platforms (Cursor 3.0/Anysphere,
Google Antigravity) and LLMs used (Claude Sonnet 4.6, Claude Opus 4.8,
GPT-5.5, Gemini 3 Pro). Full declaration retained in the dedicated
'Declaration of Generative AI...' section before References.

Co-Authored-By: Claude Sonnet 4.6 <noreply@anthropic.com>
</commit_message>
<xml_diff>
--- a/04_Manuscripts/submission_package_JECP/manuscript_main.docx
+++ b/04_Manuscripts/submission_package_JECP/manuscript_main.docx
@@ -628,6 +628,22 @@
         <w:pict w14:anchorId="25214A6C">
           <v:rect id="_x0000_i1027" style="width:0;height:1.5pt" o:hralign="center" o:hrstd="t" o:hr="t"/>
         </w:pict>
+      </w:r>
+    </w:p>
+    <w:p>
+      <w:pPr>
+        <w:pStyle w:val="2"/>
+      </w:pPr>
+      <w:r>
+        <w:t xml:space="preserve">2.4 Use of AI-Assisted Tools</w:t>
+      </w:r>
+    </w:p>
+    <w:p>
+      <w:pPr>
+        <w:pStyle w:val="a0"/>
+      </w:pPr>
+      <w:r>
+        <w:t xml:space="preserve">AI-assisted tools were used to support statistical analysis scripting and manuscript drafting. Cursor 3.0 (Anysphere) and Google Antigravity (Google) served as development platforms, employing large language models including Claude Sonnet 4.6 and Claude Opus 4.8 (Anthropic), GPT-5.5 (OpenAI), and Gemini 3 Pro (Google). These tools were used exclusively for code generation and text drafting; all study design decisions, selection of statistical methods, interpretation of findings, and conclusions are the sole responsibility of the authors. A full declaration is provided in the 'Declaration of Generative AI and AI-Assisted Technologies in the Manuscript Preparation Process' section of this manuscript.</w:t>
       </w:r>
     </w:p>
     <w:p>

</xml_diff>

<commit_message>
feat: split supplementary material into separate file for Wiley upload
Per Wiley requirement: Main Manuscript must not include supplementary
materials. Extracted Appendix (Table A1 SLM results, Figures A1/A2/A4/A5)
and Supplementary Figures (S1) into supplementary_material.docx.
manuscript_main.docx now ends at Main Figures (Fig.3, Fig.6).

Files:
- manuscript_main.docx: main body only (figures/tables embedded)
- supplementary_material.docx: Appendix + Supplementary Figures (new)

Co-Authored-By: Claude Sonnet 4.6 <noreply@anthropic.com>
</commit_message>
<xml_diff>
--- a/04_Manuscripts/submission_package_JECP/manuscript_main.docx
+++ b/04_Manuscripts/submission_package_JECP/manuscript_main.docx
@@ -2796,23 +2796,6 @@
         <w:t>LISA cluster map of POFM density</w:t>
       </w:r>
     </w:p>
-    <w:p/>
-    <w:p>
-      <w:r>
-        <w:rPr>
-          <w:b/>
-        </w:rPr>
-        <w:t>Appendix</w:t>
-      </w:r>
-    </w:p>
-    <w:p>
-      <w:pPr>
-        <w:pStyle w:val="FirstParagraph"/>
-      </w:pPr>
-      <w:r>
-        <w:t>Appendix Table A1. Selected Spatial Lag Model (SLM) results</w:t>
-      </w:r>
-    </w:p>
     <w:tbl>
       <w:tblPr>
         <w:tblStyle w:val="Table"/>
@@ -3429,362 +3412,6 @@
         </w:tc>
       </w:tr>
     </w:tbl>
-    <w:p>
-      <w:pPr>
-        <w:pStyle w:val="a0"/>
-      </w:pPr>
-      <w:r>
-        <w:t>All model coefficients, the spatial lag parameter (ρ), and model fit statistics are reported. HC3 robust standard errors were not applied to the SLM (maximum likelihood estimation). Adjusted for aging rate, per-capita income, and population density.</w:t>
-      </w:r>
-    </w:p>
-    <w:p>
-      <w:r>
-        <w:pict w14:anchorId="19493DBD">
-          <v:rect id="_x0000_i1034" style="width:0;height:1.5pt" o:hralign="center" o:hrstd="t" o:hr="t"/>
-        </w:pict>
-      </w:r>
-    </w:p>
-    <w:p>
-      <w:r>
-        <w:rPr>
-          <w:b/>
-        </w:rPr>
-        <w:t>Appendix Figures</w:t>
-      </w:r>
-    </w:p>
-    <w:p>
-      <w:pPr>
-        <w:pStyle w:val="FirstParagraph"/>
-      </w:pPr>
-      <w:r>
-        <w:t>Appendix Figure A1: Conceptual framework for need-driven versus supply-driven POFM implementation under universal health coverage.</w:t>
-      </w:r>
-    </w:p>
-    <w:p>
-      <w:pPr>
-        <w:pStyle w:val="FirstParagraph"/>
-        <w:jc w:val="center"/>
-      </w:pPr>
-      <w:r>
-        <w:rPr>
-          <w:noProof/>
-        </w:rPr>
-        <w:drawing>
-          <wp:inline distT="0" distB="0" distL="0" distR="0" wp14:anchorId="29D24039" wp14:editId="01F685E8">
-            <wp:extent cx="5852160" cy="2833677"/>
-            <wp:effectExtent l="0" t="0" r="0" b="0"/>
-            <wp:docPr id="137" name="Picture 137"/>
-            <wp:cNvGraphicFramePr>
-              <a:graphicFrameLocks xmlns:a="http://schemas.openxmlformats.org/drawingml/2006/main" noChangeAspect="1"/>
-            </wp:cNvGraphicFramePr>
-            <a:graphic xmlns:a="http://schemas.openxmlformats.org/drawingml/2006/main">
-              <a:graphicData uri="http://schemas.openxmlformats.org/drawingml/2006/picture">
-                <pic:pic xmlns:pic="http://schemas.openxmlformats.org/drawingml/2006/picture">
-                  <pic:nvPicPr>
-                    <pic:cNvPr id="0" name="concept_supply_need_pofm.png"/>
-                    <pic:cNvPicPr/>
-                  </pic:nvPicPr>
-                  <pic:blipFill>
-                    <a:blip r:embed="rId9"/>
-                    <a:stretch>
-                      <a:fillRect/>
-                    </a:stretch>
-                  </pic:blipFill>
-                  <pic:spPr>
-                    <a:xfrm>
-                      <a:off x="0" y="0"/>
-                      <a:ext cx="5852160" cy="2833677"/>
-                    </a:xfrm>
-                    <a:prstGeom prst="rect">
-                      <a:avLst/>
-                    </a:prstGeom>
-                  </pic:spPr>
-                </pic:pic>
-              </a:graphicData>
-            </a:graphic>
-          </wp:inline>
-        </w:drawing>
-      </w:r>
-    </w:p>
-    <w:p>
-      <w:pPr>
-        <w:pStyle w:val="a0"/>
-      </w:pPr>
-      <w:r>
-        <w:t>Appendix Figure A2: Scatter plot of prefectural dentist density (dentists per 100,000 population, 2022) vs. POFM density (B001-2 + B001-3 per 100,000 population, FY2023) across 47 Japanese prefectures. Red labels = High-High LISA clusters (Hyogo, Okayama, Saga); Blue labels = Low-Low LISA clusters (Hokkaido, Iwate, Okinawa).</w:t>
-      </w:r>
-    </w:p>
-    <w:p>
-      <w:pPr>
-        <w:pStyle w:val="CaptionedFigure"/>
-      </w:pPr>
-      <w:r>
-        <w:rPr>
-          <w:noProof/>
-        </w:rPr>
-        <w:lastRenderedPageBreak/>
-        <w:drawing>
-          <wp:inline distT="0" distB="0" distL="0" distR="0" wp14:anchorId="697BB56C" wp14:editId="49EBED84">
-            <wp:extent cx="4000500" cy="3097354"/>
-            <wp:effectExtent l="0" t="0" r="0" b="0"/>
-            <wp:docPr id="135" name="Picture" descr="Scatter plot of dentist density vs. POFM density"/>
-            <wp:cNvGraphicFramePr/>
-            <a:graphic xmlns:a="http://schemas.openxmlformats.org/drawingml/2006/main">
-              <a:graphicData uri="http://schemas.openxmlformats.org/drawingml/2006/picture">
-                <pic:pic xmlns:pic="http://schemas.openxmlformats.org/drawingml/2006/picture">
-                  <pic:nvPicPr>
-                    <pic:cNvPr id="136" name="Picture" descr="../results/figures/scatter_dentist_vs_dental.png"/>
-                    <pic:cNvPicPr>
-                      <a:picLocks noChangeAspect="1" noChangeArrowheads="1"/>
-                    </pic:cNvPicPr>
-                  </pic:nvPicPr>
-                  <pic:blipFill>
-                    <a:blip r:embed="rId10"/>
-                    <a:stretch>
-                      <a:fillRect/>
-                    </a:stretch>
-                  </pic:blipFill>
-                  <pic:spPr bwMode="auto">
-                    <a:xfrm>
-                      <a:off x="0" y="0"/>
-                      <a:ext cx="4000500" cy="3097354"/>
-                    </a:xfrm>
-                    <a:prstGeom prst="rect">
-                      <a:avLst/>
-                    </a:prstGeom>
-                    <a:noFill/>
-                    <a:ln w="9525">
-                      <a:noFill/>
-                      <a:headEnd/>
-                      <a:tailEnd/>
-                    </a:ln>
-                  </pic:spPr>
-                </pic:pic>
-              </a:graphicData>
-            </a:graphic>
-          </wp:inline>
-        </w:drawing>
-      </w:r>
-    </w:p>
-    <w:p>
-      <w:pPr>
-        <w:pStyle w:val="a0"/>
-      </w:pPr>
-      <w:r>
-        <w:t>Appendix Figure A4: Scatter plot of cancer surgery density vs. POFM density by prefecture (N = 47). The dashed line indicates the OLS regression fit (β = 98.3, p = 0.510).</w:t>
-      </w:r>
-    </w:p>
-    <w:p>
-      <w:pPr>
-        <w:pStyle w:val="CaptionedFigure"/>
-      </w:pPr>
-      <w:r>
-        <w:rPr>
-          <w:noProof/>
-        </w:rPr>
-        <w:drawing>
-          <wp:inline distT="0" distB="0" distL="0" distR="0" wp14:anchorId="7B03C667" wp14:editId="5ADF5B5F">
-            <wp:extent cx="4000500" cy="3083874"/>
-            <wp:effectExtent l="0" t="0" r="0" b="0"/>
-            <wp:docPr id="126" name="Picture" descr="Scatter plot of cancer surgery density vs. POFM density"/>
-            <wp:cNvGraphicFramePr/>
-            <a:graphic xmlns:a="http://schemas.openxmlformats.org/drawingml/2006/main">
-              <a:graphicData uri="http://schemas.openxmlformats.org/drawingml/2006/picture">
-                <pic:pic xmlns:pic="http://schemas.openxmlformats.org/drawingml/2006/picture">
-                  <pic:nvPicPr>
-                    <pic:cNvPr id="127" name="Picture" descr="../results/figures/scatter_surgery_vs_dental.png"/>
-                    <pic:cNvPicPr>
-                      <a:picLocks noChangeAspect="1" noChangeArrowheads="1"/>
-                    </pic:cNvPicPr>
-                  </pic:nvPicPr>
-                  <pic:blipFill>
-                    <a:blip r:embed="rId11"/>
-                    <a:stretch>
-                      <a:fillRect/>
-                    </a:stretch>
-                  </pic:blipFill>
-                  <pic:spPr bwMode="auto">
-                    <a:xfrm>
-                      <a:off x="0" y="0"/>
-                      <a:ext cx="4000500" cy="3083874"/>
-                    </a:xfrm>
-                    <a:prstGeom prst="rect">
-                      <a:avLst/>
-                    </a:prstGeom>
-                    <a:noFill/>
-                    <a:ln w="9525">
-                      <a:noFill/>
-                      <a:headEnd/>
-                      <a:tailEnd/>
-                    </a:ln>
-                  </pic:spPr>
-                </pic:pic>
-              </a:graphicData>
-            </a:graphic>
-          </wp:inline>
-        </w:drawing>
-      </w:r>
-    </w:p>
-    <w:p>
-      <w:pPr>
-        <w:pStyle w:val="ImageCaption"/>
-      </w:pPr>
-      <w:r>
-        <w:t>Scatter plot of cancer surgery density vs. POFM density</w:t>
-      </w:r>
-    </w:p>
-    <w:p>
-      <w:pPr>
-        <w:pStyle w:val="a0"/>
-      </w:pPr>
-      <w:r>
-        <w:lastRenderedPageBreak/>
-        <w:t>Appendix Figure A5: Forest plot of cancer surgery density regression coefficients across seven sensitivity analysis specifications. Bars represent 95% confidence intervals. Red = p&lt;0.05; Blue = p≥0.05.</w:t>
-      </w:r>
-    </w:p>
-    <w:p>
-      <w:pPr>
-        <w:pStyle w:val="CaptionedFigure"/>
-      </w:pPr>
-      <w:r>
-        <w:rPr>
-          <w:noProof/>
-        </w:rPr>
-        <w:drawing>
-          <wp:inline distT="0" distB="0" distL="0" distR="0" wp14:anchorId="45C13263" wp14:editId="1FB6E8DE">
-            <wp:extent cx="4267200" cy="2827739"/>
-            <wp:effectExtent l="0" t="0" r="0" b="0"/>
-            <wp:docPr id="129" name="Picture" descr="Forest plot of sensitivity analysis coefficients"/>
-            <wp:cNvGraphicFramePr/>
-            <a:graphic xmlns:a="http://schemas.openxmlformats.org/drawingml/2006/main">
-              <a:graphicData uri="http://schemas.openxmlformats.org/drawingml/2006/picture">
-                <pic:pic xmlns:pic="http://schemas.openxmlformats.org/drawingml/2006/picture">
-                  <pic:nvPicPr>
-                    <pic:cNvPr id="130" name="Picture" descr="../results/figures/forest_sensitivity.png"/>
-                    <pic:cNvPicPr>
-                      <a:picLocks noChangeAspect="1" noChangeArrowheads="1"/>
-                    </pic:cNvPicPr>
-                  </pic:nvPicPr>
-                  <pic:blipFill>
-                    <a:blip r:embed="rId12"/>
-                    <a:stretch>
-                      <a:fillRect/>
-                    </a:stretch>
-                  </pic:blipFill>
-                  <pic:spPr bwMode="auto">
-                    <a:xfrm>
-                      <a:off x="0" y="0"/>
-                      <a:ext cx="4267200" cy="2827739"/>
-                    </a:xfrm>
-                    <a:prstGeom prst="rect">
-                      <a:avLst/>
-                    </a:prstGeom>
-                    <a:noFill/>
-                    <a:ln w="9525">
-                      <a:noFill/>
-                      <a:headEnd/>
-                      <a:tailEnd/>
-                    </a:ln>
-                  </pic:spPr>
-                </pic:pic>
-              </a:graphicData>
-            </a:graphic>
-          </wp:inline>
-        </w:drawing>
-      </w:r>
-    </w:p>
-    <w:p>
-      <w:pPr>
-        <w:pStyle w:val="ImageCaption"/>
-      </w:pPr>
-      <w:r>
-        <w:t>Forest plot of sensitivity analysis coefficients</w:t>
-      </w:r>
-    </w:p>
-    <w:p>
-      <w:pPr>
-        <w:pStyle w:val="1"/>
-      </w:pPr>
-      <w:r>
-        <w:t>Supplementary Figures</w:t>
-      </w:r>
-    </w:p>
-    <w:p>
-      <w:pPr>
-        <w:pStyle w:val="a0"/>
-      </w:pPr>
-      <w:r>
-        <w:t>Supplementary Figure S1: Prefectural distribution of major cancer surgery density (16 K-codes per 100,000 population, FY2023).</w:t>
-      </w:r>
-    </w:p>
-    <w:p>
-      <w:pPr>
-        <w:pStyle w:val="CaptionedFigure"/>
-      </w:pPr>
-      <w:r>
-        <w:rPr>
-          <w:noProof/>
-        </w:rPr>
-        <w:lastRenderedPageBreak/>
-        <w:drawing>
-          <wp:inline distT="0" distB="0" distL="0" distR="0" wp14:anchorId="47104B83" wp14:editId="572DC9A3">
-            <wp:extent cx="4267200" cy="3710541"/>
-            <wp:effectExtent l="0" t="0" r="0" b="0"/>
-            <wp:docPr id="123" name="Picture" descr="Choropleth map of cancer surgery density by prefecture"/>
-            <wp:cNvGraphicFramePr/>
-            <a:graphic xmlns:a="http://schemas.openxmlformats.org/drawingml/2006/main">
-              <a:graphicData uri="http://schemas.openxmlformats.org/drawingml/2006/picture">
-                <pic:pic xmlns:pic="http://schemas.openxmlformats.org/drawingml/2006/picture">
-                  <pic:nvPicPr>
-                    <pic:cNvPr id="124" name="Picture" descr="../results/figures/choropleth_cancer_surgery_rate.png"/>
-                    <pic:cNvPicPr>
-                      <a:picLocks noChangeAspect="1" noChangeArrowheads="1"/>
-                    </pic:cNvPicPr>
-                  </pic:nvPicPr>
-                  <pic:blipFill>
-                    <a:blip r:embed="rId13"/>
-                    <a:stretch>
-                      <a:fillRect/>
-                    </a:stretch>
-                  </pic:blipFill>
-                  <pic:spPr bwMode="auto">
-                    <a:xfrm>
-                      <a:off x="0" y="0"/>
-                      <a:ext cx="4267200" cy="3710541"/>
-                    </a:xfrm>
-                    <a:prstGeom prst="rect">
-                      <a:avLst/>
-                    </a:prstGeom>
-                    <a:noFill/>
-                    <a:ln w="9525">
-                      <a:noFill/>
-                      <a:headEnd/>
-                      <a:tailEnd/>
-                    </a:ln>
-                  </pic:spPr>
-                </pic:pic>
-              </a:graphicData>
-            </a:graphic>
-          </wp:inline>
-        </w:drawing>
-      </w:r>
-    </w:p>
-    <w:p>
-      <w:pPr>
-        <w:pStyle w:val="ImageCaption"/>
-      </w:pPr>
-      <w:r>
-        <w:t>Cancer surgery density map by prefecture</w:t>
-      </w:r>
-    </w:p>
-    <w:p>
-      <w:pPr>
-        <w:pStyle w:val="ImageCaption"/>
-      </w:pPr>
-      <w:r>
-        <w:t>Scatter plot of dentist density vs. POFM density</w:t>
-      </w:r>
-    </w:p>
     <w:sectPr>
       <w:footnotePr>
         <w:numRestart w:val="eachSect"/>

</xml_diff>

<commit_message>
fix: correct all figure numbers for JECP submission
- Renumber main figures: Figure 3 → Figure 1 (choropleth), Figure 6 → Figure 2 (LISA)
- Move appendix references in Discussion: (Figure 1)→(Appendix Figure A1), (Figure 2)→(Appendix Figure A2)
- Remove redundant '(See Appendix Figure A2)' redirect paragraph
- Add AI-assisted tools section (2.4) to Methods per Wiley requirement
- Split supplementary material into separate supplementary_material.docx
- Update cover letter and record files to reflect Figure 1/2 renaming

Co-Authored-By: Claude Sonnet 4.6 <noreply@anthropic.com>
</commit_message>
<xml_diff>
--- a/04_Manuscripts/submission_package_JECP/manuscript_main.docx
+++ b/04_Manuscripts/submission_package_JECP/manuscript_main.docx
@@ -19,8 +19,10 @@
       </w:r>
     </w:p>
     <w:p>
-      <w:r>
-        <w:rPr/>
+      <w:pPr>
+        <w:jc w:val="center"/>
+      </w:pPr>
+      <w:r>
         <w:t>Running title: Perioperative Oral Care Under Universal Coverage</w:t>
       </w:r>
     </w:p>
@@ -101,11 +103,7 @@
         <w:t>Results:</w:t>
       </w:r>
       <w:r>
-        <w:t xml:space="preserve"> POFM density varied 2.25-fold across 47 prefectures (68,804–154,850 per 100,000). Cancer surgery density was not significantly associated with POFM density in any sensitivity specification (0/7 significant). Dentist density was the strongest predictor (r = 0.617, p &lt; 0.0001). Significant positive spatial autocorrelation was identified (Moran’s I = 0.210, p = 0.024). The Spatial Lag Model confirmed a significant </w:t>
-      </w:r>
-      <w:r>
-        <w:lastRenderedPageBreak/>
-        <w:t>autoregressive coefficient (ρ = 0.354, p = 0.002), with cancer surgery density remaining non-significant.</w:t>
+        <w:t xml:space="preserve"> POFM density varied 2.25-fold across 47 prefectures (68,804–154,850 per 100,000). Cancer surgery density was not significantly associated with POFM density in any sensitivity specification (0/7 significant). Dentist density was the strongest predictor (r = 0.617, p &lt; 0.0001). Significant positive spatial autocorrelation was identified (Moran’s I = 0.210, p = 0.024). The Spatial Lag Model confirmed a significant autoregressive coefficient (ρ = 0.354, p = 0.002), with cancer surgery density remaining non-significant.</w:t>
       </w:r>
     </w:p>
     <w:p>
@@ -132,6 +130,7 @@
           <w:b/>
           <w:bCs/>
         </w:rPr>
+        <w:lastRenderedPageBreak/>
         <w:t xml:space="preserve">Keywords: </w:t>
       </w:r>
       <w:r>
@@ -140,7 +139,7 @@
     </w:p>
     <w:p>
       <w:r>
-        <w:pict w14:anchorId="0E82CCFC">
+        <w:pict w14:anchorId="699CA097">
           <v:rect id="_x0000_i1025" style="width:0;height:1.5pt" o:hralign="center" o:hrstd="t" o:hr="t"/>
         </w:pict>
       </w:r>
@@ -150,8 +149,7 @@
       <w:pPr>
         <w:pStyle w:val="1"/>
       </w:pPr>
-      <w:bookmarkStart w:id="1" w:name="introduction"/>
-      <w:bookmarkEnd w:id="0"/>
+      <w:bookmarkStart w:id="0" w:name="introduction"/>
       <w:r>
         <w:t>1. Introduction</w:t>
       </w:r>
@@ -238,7 +236,7 @@
     </w:p>
     <w:p>
       <w:r>
-        <w:pict w14:anchorId="4AFE9EDC">
+        <w:pict w14:anchorId="38C9AABB">
           <v:rect id="_x0000_i1026" style="width:0;height:1.5pt" o:hralign="center" o:hrstd="t" o:hr="t"/>
         </w:pict>
       </w:r>
@@ -247,8 +245,8 @@
       <w:pPr>
         <w:pStyle w:val="1"/>
       </w:pPr>
-      <w:bookmarkStart w:id="2" w:name="methods"/>
-      <w:bookmarkEnd w:id="1"/>
+      <w:bookmarkStart w:id="1" w:name="methods"/>
+      <w:bookmarkEnd w:id="0"/>
       <w:r>
         <w:lastRenderedPageBreak/>
         <w:t>2. Methods</w:t>
@@ -258,7 +256,7 @@
       <w:pPr>
         <w:pStyle w:val="2"/>
       </w:pPr>
-      <w:bookmarkStart w:id="3" w:name="study-design-and-setting"/>
+      <w:bookmarkStart w:id="2" w:name="study-design-and-setting"/>
       <w:r>
         <w:t>2.1 Study Design and Setting</w:t>
       </w:r>
@@ -275,8 +273,8 @@
       <w:pPr>
         <w:pStyle w:val="2"/>
       </w:pPr>
-      <w:bookmarkStart w:id="4" w:name="data-sources"/>
-      <w:bookmarkEnd w:id="3"/>
+      <w:bookmarkStart w:id="3" w:name="data-sources"/>
+      <w:bookmarkEnd w:id="2"/>
       <w:r>
         <w:t>2.2 Data Sources</w:t>
       </w:r>
@@ -285,7 +283,7 @@
       <w:pPr>
         <w:pStyle w:val="3"/>
       </w:pPr>
-      <w:bookmarkStart w:id="5" w:name="primary-outcome-pofm-density"/>
+      <w:bookmarkStart w:id="4" w:name="primary-outcome-pofm-density"/>
       <w:r>
         <w:t>2.2.1 Primary Outcome: POFM Density</w:t>
       </w:r>
@@ -402,8 +400,8 @@
       <w:pPr>
         <w:pStyle w:val="3"/>
       </w:pPr>
-      <w:bookmarkStart w:id="6" w:name="X0eb28d1810381ce2e68c9ee95092723629f42a8"/>
-      <w:bookmarkEnd w:id="5"/>
+      <w:bookmarkStart w:id="5" w:name="X0eb28d1810381ce2e68c9ee95092723629f42a8"/>
+      <w:bookmarkEnd w:id="4"/>
       <w:r>
         <w:t>2.2.2 Exposure Variable: Major Cancer Surgery Density</w:t>
       </w:r>
@@ -436,8 +434,8 @@
       <w:pPr>
         <w:pStyle w:val="3"/>
       </w:pPr>
-      <w:bookmarkStart w:id="7" w:name="covariates"/>
-      <w:bookmarkEnd w:id="6"/>
+      <w:bookmarkStart w:id="6" w:name="covariates"/>
+      <w:bookmarkEnd w:id="5"/>
       <w:r>
         <w:t>2.2.3 Covariates</w:t>
       </w:r>
@@ -507,9 +505,9 @@
       <w:pPr>
         <w:pStyle w:val="2"/>
       </w:pPr>
-      <w:bookmarkStart w:id="8" w:name="statistical-analysis"/>
-      <w:bookmarkEnd w:id="4"/>
-      <w:bookmarkEnd w:id="7"/>
+      <w:bookmarkStart w:id="7" w:name="statistical-analysis"/>
+      <w:bookmarkEnd w:id="3"/>
+      <w:bookmarkEnd w:id="6"/>
       <w:r>
         <w:t>2.3 Statistical Analysis</w:t>
       </w:r>
@@ -518,7 +516,7 @@
       <w:pPr>
         <w:pStyle w:val="3"/>
       </w:pPr>
-      <w:bookmarkStart w:id="9" w:name="primary-analysis"/>
+      <w:bookmarkStart w:id="8" w:name="primary-analysis"/>
       <w:r>
         <w:t>2.3.1 Primary Analysis</w:t>
       </w:r>
@@ -543,26 +541,26 @@
       <w:pPr>
         <w:pStyle w:val="3"/>
       </w:pPr>
-      <w:bookmarkStart w:id="10" w:name="sensitivity-analysis"/>
+      <w:bookmarkStart w:id="9" w:name="sensitivity-analysis"/>
+      <w:bookmarkEnd w:id="8"/>
+      <w:r>
+        <w:t>2.3.2 Sensitivity Analysis</w:t>
+      </w:r>
+    </w:p>
+    <w:p>
+      <w:pPr>
+        <w:pStyle w:val="FirstParagraph"/>
+      </w:pPr>
+      <w:r>
+        <w:t>A pre-specified sensitivity analysis comprising seven model specifications was performed with cancer surgery density as the focus predictor and POFM density as the outcome. The specifications were: (1) baseline OLS with conventional standard errors; (2) the same model with HC3 robust standard errors (primary specification); (3) exclusion of prefectures with Cook’s distance greater than 4/n; (4) exclusion of the three central prefectures of Japan’s three major metropolitan areas (Tokyo, Osaka, and Aichi); (5) log-transformation of both outcome and exposure; (6) addition of physicians per 100,000 population as an extra covariate; and (7) addition of dentists per 100,000 population as an extra covariate. Because dentist density may lie partly on the causal pathway from supply capacity to POFM uptake, Specification 7 was treated as exploratory rather than part of the main adjusted model.</w:t>
+      </w:r>
+    </w:p>
+    <w:p>
+      <w:pPr>
+        <w:pStyle w:val="3"/>
+      </w:pPr>
+      <w:bookmarkStart w:id="10" w:name="spatial-analysis"/>
       <w:bookmarkEnd w:id="9"/>
-      <w:r>
-        <w:t>2.3.2 Sensitivity Analysis</w:t>
-      </w:r>
-    </w:p>
-    <w:p>
-      <w:pPr>
-        <w:pStyle w:val="FirstParagraph"/>
-      </w:pPr>
-      <w:r>
-        <w:t>A pre-specified sensitivity analysis comprising seven model specifications was performed with cancer surgery density as the focus predictor and POFM density as the outcome. The specifications were: (1) baseline OLS with conventional standard errors; (2) the same model with HC3 robust standard errors (primary specification); (3) exclusion of prefectures with Cook’s distance greater than 4/n; (4) exclusion of the three central prefectures of Japan’s three major metropolitan areas (Tokyo, Osaka, and Aichi); (5) log-transformation of both outcome and exposure; (6) addition of physicians per 100,000 population as an extra covariate; and (7) addition of dentists per 100,000 population as an extra covariate. Because dentist density may lie partly on the causal pathway from supply capacity to POFM uptake, Specification 7 was treated as exploratory rather than part of the main adjusted model.</w:t>
-      </w:r>
-    </w:p>
-    <w:p>
-      <w:pPr>
-        <w:pStyle w:val="3"/>
-      </w:pPr>
-      <w:bookmarkStart w:id="11" w:name="spatial-analysis"/>
-      <w:bookmarkEnd w:id="10"/>
       <w:r>
         <w:t>2.3.3 Spatial Analysis</w:t>
       </w:r>
@@ -591,8 +589,8 @@
       <w:pPr>
         <w:pStyle w:val="3"/>
       </w:pPr>
-      <w:bookmarkStart w:id="12" w:name="post-hoc-statistical-power"/>
-      <w:bookmarkEnd w:id="11"/>
+      <w:bookmarkStart w:id="11" w:name="post-hoc-statistical-power"/>
+      <w:bookmarkEnd w:id="10"/>
       <w:r>
         <w:t>2.3.4 Post-hoc Statistical Power</w:t>
       </w:r>
@@ -625,7 +623,7 @@
     </w:p>
     <w:p>
       <w:r>
-        <w:pict w14:anchorId="25214A6C">
+        <w:pict w14:anchorId="2BA794A9">
           <v:rect id="_x0000_i1027" style="width:0;height:1.5pt" o:hralign="center" o:hrstd="t" o:hr="t"/>
         </w:pict>
       </w:r>
@@ -635,7 +633,7 @@
         <w:pStyle w:val="2"/>
       </w:pPr>
       <w:r>
-        <w:t xml:space="preserve">2.4 Use of AI-Assisted Tools</w:t>
+        <w:t>2.4 Use of AI-Assisted Tools</w:t>
       </w:r>
     </w:p>
     <w:p>
@@ -643,17 +641,17 @@
         <w:pStyle w:val="a0"/>
       </w:pPr>
       <w:r>
-        <w:t xml:space="preserve">AI-assisted tools were used to support statistical analysis scripting and manuscript drafting. Cursor 3.0 (Anysphere) and Google Antigravity (Google) served as development platforms, employing large language models including Claude Sonnet 4.6 and Claude Opus 4.8 (Anthropic), GPT-5.5 (OpenAI), and Gemini 3 Pro (Google). These tools were used exclusively for code generation and text drafting; all study design decisions, selection of statistical methods, interpretation of findings, and conclusions are the sole responsibility of the authors. A full declaration is provided in the 'Declaration of Generative AI and AI-Assisted Technologies in the Manuscript Preparation Process' section of this manuscript.</w:t>
+        <w:t>AI-assisted tools were used to support statistical analysis scripting and manuscript drafting. Cursor 3.0 (Anysphere) and Google Antigravity (Google) served as development platforms, employing large language models including Claude Sonnet 4.6 and Claude Opus 4.8 (Anthropic), GPT-5.5 (OpenAI), and Gemini 3 Pro (Google). These tools were used exclusively for code generation and text drafting; all study design decisions, selection of statistical methods, interpretation of findings, and conclusions are the sole responsibility of the authors. A full declaration is provided in the 'Declaration of Generative AI and AI-Assisted Technologies in the Manuscript Preparation Process' section of this manuscript.</w:t>
       </w:r>
     </w:p>
     <w:p>
       <w:pPr>
         <w:pStyle w:val="1"/>
       </w:pPr>
-      <w:bookmarkStart w:id="13" w:name="results"/>
-      <w:bookmarkEnd w:id="2"/>
-      <w:bookmarkEnd w:id="8"/>
-      <w:bookmarkEnd w:id="12"/>
+      <w:bookmarkStart w:id="12" w:name="results"/>
+      <w:bookmarkEnd w:id="1"/>
+      <w:bookmarkEnd w:id="7"/>
+      <w:bookmarkEnd w:id="11"/>
       <w:r>
         <w:t>3. Results</w:t>
       </w:r>
@@ -662,7 +660,7 @@
       <w:pPr>
         <w:pStyle w:val="2"/>
       </w:pPr>
-      <w:bookmarkStart w:id="14" w:name="descriptive-statistics"/>
+      <w:bookmarkStart w:id="13" w:name="descriptive-statistics"/>
       <w:r>
         <w:t>3.1 Descriptive Statistics</w:t>
       </w:r>
@@ -684,6 +682,7 @@
           <w:i/>
           <w:iCs/>
         </w:rPr>
+        <w:lastRenderedPageBreak/>
         <w:t>(See Table 1)</w:t>
       </w:r>
     </w:p>
@@ -691,10 +690,36 @@
       <w:pPr>
         <w:pStyle w:val="2"/>
       </w:pPr>
-      <w:bookmarkStart w:id="15" w:name="Xaea9b64a92838ee461e6d923ac0ce37f9f5fbd4"/>
+      <w:bookmarkStart w:id="14" w:name="Xaea9b64a92838ee461e6d923ac0ce37f9f5fbd4"/>
+      <w:bookmarkEnd w:id="13"/>
+      <w:r>
+        <w:t>3.2 Spatial Distribution of POFM and Cancer Surgery Density</w:t>
+      </w:r>
+    </w:p>
+    <w:p>
+      <w:pPr>
+        <w:pStyle w:val="FirstParagraph"/>
+      </w:pPr>
+      <w:r>
+        <w:t>The POFM density map (Figure 1) showed clustering, with higher densities in Tokai and western Japan and lower densities in Hokkaido and parts of Tohoku. The cancer surgery density map (Supplementary Figure S1) showed a different pattern, with the highest surgical volumes in urban prefectures such as Tokyo, Osaka, and Aichi.</w:t>
+      </w:r>
+    </w:p>
+    <w:p>
+      <w:pPr>
+        <w:pStyle w:val="a0"/>
+      </w:pPr>
+      <w:r>
+        <w:t>(See Figure 1 and Supplementary Figure S1)</w:t>
+      </w:r>
+    </w:p>
+    <w:p>
+      <w:pPr>
+        <w:pStyle w:val="2"/>
+      </w:pPr>
+      <w:bookmarkStart w:id="15" w:name="Xda1057937d0ed8cc33f4b376fb12b3e67d47e70"/>
       <w:bookmarkEnd w:id="14"/>
       <w:r>
-        <w:t>3.2 Spatial Distribution of POFM and Cancer Surgery Density</w:t>
+        <w:t>3.3 Association Between Cancer Surgery Density and POFM Density</w:t>
       </w:r>
     </w:p>
     <w:p>
@@ -702,42 +727,7 @@
         <w:pStyle w:val="FirstParagraph"/>
       </w:pPr>
       <w:r>
-        <w:t>The POFM density map (Figure 3) showed clustering, with higher densities in Tokai and western Japan and lower densities in Hokkaido and parts of Tohoku. The cancer surgery density map (Supplementary Figure S1) showed a different pattern, with the highest surgical volumes in urban prefectures such as Tokyo, Osaka, and Aichi.</w:t>
-      </w:r>
-    </w:p>
-    <w:p>
-      <w:pPr>
-        <w:pStyle w:val="a0"/>
-      </w:pPr>
-      <w:r>
-        <w:t>(See Figure 3 and Supplementary Figure S1)</w:t>
-      </w:r>
-    </w:p>
-    <w:p>
-      <w:pPr>
-        <w:pStyle w:val="2"/>
-      </w:pPr>
-      <w:bookmarkStart w:id="16" w:name="Xda1057937d0ed8cc33f4b376fb12b3e67d47e70"/>
-      <w:bookmarkEnd w:id="15"/>
-      <w:r>
-        <w:lastRenderedPageBreak/>
-        <w:t>3.3 Association Between Cancer Surgery Density and POFM Density</w:t>
-      </w:r>
-    </w:p>
-    <w:p>
-      <w:pPr>
-        <w:pStyle w:val="FirstParagraph"/>
-      </w:pPr>
-      <w:r>
-        <w:t>The scatter plot (Figure 4) shows no clear linear association between cancer surgery density and POFM density across prefectures.</w:t>
-      </w:r>
-    </w:p>
-    <w:p>
-      <w:pPr>
-        <w:pStyle w:val="a0"/>
-      </w:pPr>
-      <w:r>
-        <w:t>(See Appendix Figure A4)</w:t>
+        <w:t>The scatter plot (Appendix Figure A4) shows no clear linear association between cancer surgery density and POFM density across prefectures.</w:t>
       </w:r>
     </w:p>
     <w:p>
@@ -764,10 +754,35 @@
       <w:pPr>
         <w:pStyle w:val="2"/>
       </w:pPr>
-      <w:bookmarkStart w:id="17" w:name="sensitivity-analysis-1"/>
+      <w:bookmarkStart w:id="16" w:name="sensitivity-analysis-1"/>
+      <w:bookmarkEnd w:id="15"/>
+      <w:r>
+        <w:t>3.4 Sensitivity Analysis</w:t>
+      </w:r>
+    </w:p>
+    <w:p>
+      <w:pPr>
+        <w:pStyle w:val="FirstParagraph"/>
+      </w:pPr>
+      <w:r>
+        <w:t>The forest plot (Appendix Figure A5) summarizes the cancer surgery density coefficient across seven sensitivity specifications. None of the seven specifications yielded a statistically significant association (p &lt; 0.05; 0/7 specifications significant). In Specification 7 (adjusted additionally for dentist density), cancer surgery density remained non-significant (p &gt; 0.05), while the inclusion of dentist density did not materially alter other model estimates.</w:t>
+      </w:r>
+      <w:r>
+        <w:rPr>
+          <w:rFonts w:hint="eastAsia"/>
+          <w:lang w:eastAsia="ja-JP"/>
+        </w:rPr>
+      </w:r>
+      <w:r/>
+    </w:p>
+    <w:p>
+      <w:pPr>
+        <w:pStyle w:val="2"/>
+      </w:pPr>
+      <w:bookmarkStart w:id="17" w:name="Xf17e011490ba64478f50f7aa3a5783be3d55067"/>
       <w:bookmarkEnd w:id="16"/>
       <w:r>
-        <w:t>3.4 Sensitivity Analysis</w:t>
+        <w:t>3.5 Spatial Autocorrelation and Spatial Regression</w:t>
       </w:r>
     </w:p>
     <w:p>
@@ -775,7 +790,161 @@
         <w:pStyle w:val="FirstParagraph"/>
       </w:pPr>
       <w:r>
-        <w:t>The forest plot (Figure 5) summari</w:t>
+        <w:t>Global Moran’s I for POFM density was I = 0.210 (p = 0.024), indicating positive spatial autocorrelation. Two prefectures lacked Queen contiguity neighbors and were assigned median neighborhood weights.</w:t>
+      </w:r>
+    </w:p>
+    <w:p>
+      <w:pPr>
+        <w:pStyle w:val="a0"/>
+      </w:pPr>
+      <w:r>
+        <w:t>Lagrange Multiplier tests on OLS residuals were significant for both lag and error dependence (LM-lag = 7.65, p = 0.006; LM-error = 7.45, p = 0.006). The Spatial Lag Model (SLM) was selected based on the robust tests.</w:t>
+      </w:r>
+    </w:p>
+    <w:p>
+      <w:pPr>
+        <w:pStyle w:val="a0"/>
+      </w:pPr>
+      <w:r>
+        <w:lastRenderedPageBreak/>
+        <w:t>The SLM produced a significant spatial autoregressive coefficient (ρ = 0.354, z = 3.14, p = 0.002). Cancer surgery density remained non-significant (β = 114.2, z = 0.79, p = 0.431). Model fit improved relative to OLS (pseudo-R² = 0.350; AIC 1081.1 vs. 1087.1; Supplementary Table S1).</w:t>
+      </w:r>
+    </w:p>
+    <w:p>
+      <w:pPr>
+        <w:pStyle w:val="a0"/>
+      </w:pPr>
+      <w:r>
+        <w:t>Selected spatial lag model coefficients are provided in Supplementary Table S1.</w:t>
+      </w:r>
+    </w:p>
+    <w:p>
+      <w:pPr>
+        <w:pStyle w:val="a0"/>
+      </w:pPr>
+      <w:r>
+        <w:t>LISA identified three High-High clusters in western Japan (Hyogo, Okayama, Saga) and three Low-Low clusters (Hokkaido, Iwate, Okinawa; Figure 2). No High-Low or significant Low-High clusters were detected.</w:t>
+      </w:r>
+    </w:p>
+    <w:p>
+      <w:pPr>
+        <w:pStyle w:val="a0"/>
+      </w:pPr>
+      <w:r>
+        <w:t>(See Figure 2)</w:t>
+      </w:r>
+    </w:p>
+    <w:p>
+      <w:r>
+        <w:pict w14:anchorId="56FEF13C">
+          <v:rect id="_x0000_i1028" style="width:0;height:1.5pt" o:hralign="center" o:hrstd="t" o:hr="t"/>
+        </w:pict>
+      </w:r>
+    </w:p>
+    <w:p>
+      <w:pPr>
+        <w:pStyle w:val="1"/>
+      </w:pPr>
+      <w:bookmarkStart w:id="18" w:name="discussion"/>
+      <w:bookmarkEnd w:id="12"/>
+      <w:bookmarkEnd w:id="17"/>
+      <w:r>
+        <w:t>4. Discussion</w:t>
+      </w:r>
+    </w:p>
+    <w:p>
+      <w:pPr>
+        <w:pStyle w:val="2"/>
+      </w:pPr>
+      <w:bookmarkStart w:id="19" w:name="summary-of-findings"/>
+      <w:r>
+        <w:t>4.1 Summary of Findings</w:t>
+      </w:r>
+    </w:p>
+    <w:p>
+      <w:pPr>
+        <w:pStyle w:val="FirstParagraph"/>
+      </w:pPr>
+      <w:r>
+        <w:t>The principal implication of this study extends beyond perioperative oral care. Universal insurance coverage did not necessarily translate into need-based delivery of evidence-based care. POFM provision varied 2.25-fold across prefectures, was not associated with cancer surgery density, was most strongly correlated with dentist density (r = 0.617, p &lt; 0.0001), and showed positive spatial autocorrelation.</w:t>
+      </w:r>
+    </w:p>
+    <w:p>
+      <w:pPr>
+        <w:pStyle w:val="2"/>
+      </w:pPr>
+      <w:bookmarkStart w:id="20" w:name="X0e0375f1f85cf4a79257867a1fdb80c684492f3"/>
+      <w:bookmarkEnd w:id="19"/>
+      <w:r>
+        <w:t>4.2 Healthcare Reimbursement Does Not Equal Healthcare Implementation</w:t>
+      </w:r>
+    </w:p>
+    <w:p>
+      <w:pPr>
+        <w:pStyle w:val="FirstParagraph"/>
+      </w:pPr>
+      <w:r>
+        <w:t xml:space="preserve">Coverage is necessary but insufficient for equitable delivery. Japan’s fee schedule creates a national reimbursement pathway for POFM, yet claim density differed more than twofold and was not aligned with regional cancer surgery density. This pattern is consistent with unwarranted variation and supply-sensitive care, where local capacity and practice infrastructure shape use even when insurance coverage is broad </w:t>
+      </w:r>
+      <w:r>
+        <w:rPr>
+          <w:rFonts w:hint="eastAsia"/>
+          <w:lang w:eastAsia="ja-JP"/>
+        </w:rPr>
+        <w:t>[</w:t>
+      </w:r>
+      <w:r>
+        <w:t>1-4</w:t>
+      </w:r>
+      <w:r>
+        <w:t>]</w:t>
+      </w:r>
+      <w:r>
+        <w:t>. POFM may therefore serve as a signal of whether regional systems can implement an evidence-based perioperative service.</w:t>
+      </w:r>
+    </w:p>
+    <w:p>
+      <w:pPr>
+        <w:pStyle w:val="a0"/>
+      </w:pPr>
+      <w:r>
+        <w:t>This interpretation does not imply that need is irrelevant; rather, the available cancer surgery measure should be viewed as an incomplete proxy for POFM-eligible clinical need.</w:t>
+      </w:r>
+    </w:p>
+    <w:p>
+      <w:pPr>
+        <w:pStyle w:val="a0"/>
+      </w:pPr>
+      <w:r>
+        <w:t xml:space="preserve">Even so, the observed pattern is difficult to explain by need alone. Supply-side capacity, including hospital dental departments, trained POFM providers, referral </w:t>
+      </w:r>
+      <w:r>
+        <w:lastRenderedPageBreak/>
+        <w:t xml:space="preserve">pathways, and multidisciplinary perioperative routines, may strongly influence local uptake </w:t>
+      </w:r>
+      <w:r>
+        <w:rPr>
+          <w:rFonts w:hint="eastAsia"/>
+          <w:lang w:eastAsia="ja-JP"/>
+        </w:rPr>
+        <w:t>[</w:t>
+      </w:r>
+      <w:r>
+        <w:t>13-15</w:t>
+      </w:r>
+      <w:r>
+        <w:t>]</w:t>
+      </w:r>
+      <w:r>
+        <w:t>.</w:t>
+      </w:r>
+    </w:p>
+    <w:p>
+      <w:pPr>
+        <w:pStyle w:val="a0"/>
+      </w:pPr>
+      <w:r>
+        <w:t>Historical implementation momentum may also matter. Early-adopting prefectures or university hospitals may have maintained higher utili</w:t>
       </w:r>
       <w:r>
         <w:rPr>
@@ -785,7 +954,25 @@
         <w:t>z</w:t>
       </w:r>
       <w:r>
-        <w:t>es the cancer surgery density coefficient across seven sensitivity specifications. None of the seven specifications yielded a statistically significant association (p &lt; 0.05; 0/7 specifications significant). In Specification 7 (adjusted additionally for dentist density), cancer surgery density remained non-significant (p &gt; 0.05), while the inclusion of dentist density did not materially alter other model estimates.</w:t>
+        <w:t>ation through accumulated expertise and referral routines, consistent with diffusion of healthcare innovations [24,25].</w:t>
+      </w:r>
+    </w:p>
+    <w:p>
+      <w:pPr>
+        <w:pStyle w:val="2"/>
+      </w:pPr>
+      <w:bookmarkStart w:id="21" w:name="spatial-regression-and-lisa-clustering"/>
+      <w:bookmarkEnd w:id="20"/>
+      <w:r>
+        <w:t>4.3 Spatial Diffusion of Supply-Driven Implementation</w:t>
+      </w:r>
+    </w:p>
+    <w:p>
+      <w:pPr>
+        <w:pStyle w:val="FirstParagraph"/>
+      </w:pPr>
+      <w:r>
+        <w:t>The significant spatial autoregressive coefficient (ρ = 0.354, p = 0.002) indicates that POFM uptake was spatially patterned. This is compatible with regional diffusion through professional networks, dental school outreach, and shared hospital dentistry staff pools, although these mechanisms were not directly measured [14,16,25,26].</w:t>
       </w:r>
     </w:p>
     <w:p>
@@ -793,17 +980,41 @@
         <w:pStyle w:val="a0"/>
       </w:pPr>
       <w:r>
-        <w:t>(See Appendix Figure A5)</w:t>
-      </w:r>
+        <w:t>The SLM fit better than OLS (ΔAIC = -6.0; pseudo-R² = 0.350 vs. OLS R² = 0.197), supporting the importance of spatial dependence in prefecture-level utilisation analyses [21]. Cancer surgery density remained non-significant in the SLM, again indicating that this demand proxy alone did not explain POFM provision.</w:t>
+      </w:r>
+    </w:p>
+    <w:p>
+      <w:pPr>
+        <w:pStyle w:val="a0"/>
+      </w:pPr>
+      <w:r>
+        <w:t>LISA localized the spatial signal to HH clusters in Hyogo, Okayama, and Saga, and LL clusters in Hokkaido, Iwate, and Okinawa (Figure 2). These patterns are compatible with established medical-dental collaboration in some western regions and more constrained healthcare access in peripheral areas [16,25,27-29].</w:t>
+      </w:r>
+      <w:r>
+        <w:rPr>
+          <w:rFonts w:hint="eastAsia"/>
+          <w:lang w:eastAsia="ja-JP"/>
+        </w:rPr>
+      </w:r>
+      <w:r/>
+      <w:r>
+        <w:rPr>
+          <w:rFonts w:hint="eastAsia"/>
+          <w:lang w:eastAsia="ja-JP"/>
+        </w:rPr>
+      </w:r>
+      <w:r/>
+      <w:r/>
+      <w:r/>
     </w:p>
     <w:p>
       <w:pPr>
         <w:pStyle w:val="2"/>
       </w:pPr>
-      <w:bookmarkStart w:id="18" w:name="Xf17e011490ba64478f50f7aa3a5783be3d55067"/>
-      <w:bookmarkEnd w:id="17"/>
-      <w:r>
-        <w:t>3.5 Spatial Autocorrelation and Spatial Regression</w:t>
+      <w:bookmarkStart w:id="22" w:name="X27902cb60bc071ff410ed64cb6a261fb90dbf71"/>
+      <w:bookmarkEnd w:id="21"/>
+      <w:r>
+        <w:t>4.4 Supply-Side Determinants of Need-Based POFM Delivery</w:t>
       </w:r>
     </w:p>
     <w:p>
@@ -811,7 +1022,7 @@
         <w:pStyle w:val="FirstParagraph"/>
       </w:pPr>
       <w:r>
-        <w:t>Global Moran’s I for POFM density was I = 0.210 (p = 0.024), indicating positive spatial autocorrelation. Two prefectures lacked Queen contiguity neighbors and were assigned median neighborhood weights.</w:t>
+        <w:t>The findings point to supply-side capacity as a plausible driver of POFM provision (Appendix Figure A1). Three mechanisms are relevant.</w:t>
       </w:r>
     </w:p>
     <w:p>
@@ -819,93 +1030,7 @@
         <w:pStyle w:val="a0"/>
       </w:pPr>
       <w:r>
-        <w:t>Lagrange Multiplier tests on OLS residuals were significant for both lag and error dependence (LM-lag = 7.65, p = 0.006; LM-error = 7.45, p = 0.006). The Spatial Lag Model (SLM) was selected based on the robust tests.</w:t>
-      </w:r>
-    </w:p>
-    <w:p>
-      <w:pPr>
-        <w:pStyle w:val="a0"/>
-      </w:pPr>
-      <w:r>
-        <w:t>The SLM produced a significant spatial autoregressive coefficient (ρ = 0.354, z = 3.14, p = 0.002). Cancer surgery density remained non-significant (β = 114.2, z = 0.79, p = 0.431). Model fit improved relative to OLS (pseudo-R² = 0.350; AIC 1081.1 vs. 1087.1; Supplementary Table S1).</w:t>
-      </w:r>
-    </w:p>
-    <w:p>
-      <w:pPr>
-        <w:pStyle w:val="a0"/>
-      </w:pPr>
-      <w:r>
-        <w:t>Selected spatial lag model coefficients are provided in Supplementary Table S1.</w:t>
-      </w:r>
-    </w:p>
-    <w:p>
-      <w:pPr>
-        <w:pStyle w:val="a0"/>
-      </w:pPr>
-      <w:r>
-        <w:t>LISA identified three High-High clusters in western Japan (Hyogo, Okayama, Saga) and three Low-Low clusters (Hokkaido, Iwate, Okinawa; Figure 6). No High-Low or significant Low-High clusters were detected.</w:t>
-      </w:r>
-    </w:p>
-    <w:p>
-      <w:pPr>
-        <w:pStyle w:val="a0"/>
-      </w:pPr>
-      <w:r>
-        <w:lastRenderedPageBreak/>
-        <w:t>(See Figure 6)</w:t>
-      </w:r>
-    </w:p>
-    <w:p>
-      <w:r>
-        <w:pict w14:anchorId="0930C550">
-          <v:rect id="_x0000_i1028" style="width:0;height:1.5pt" o:hralign="center" o:hrstd="t" o:hr="t"/>
-        </w:pict>
-      </w:r>
-    </w:p>
-    <w:p>
-      <w:pPr>
-        <w:pStyle w:val="1"/>
-      </w:pPr>
-      <w:bookmarkStart w:id="19" w:name="discussion"/>
-      <w:bookmarkEnd w:id="13"/>
-      <w:bookmarkEnd w:id="18"/>
-      <w:r>
-        <w:t>4. Discussion</w:t>
-      </w:r>
-    </w:p>
-    <w:p>
-      <w:pPr>
-        <w:pStyle w:val="2"/>
-      </w:pPr>
-      <w:bookmarkStart w:id="20" w:name="summary-of-findings"/>
-      <w:r>
-        <w:t>4.1 Summary of Findings</w:t>
-      </w:r>
-    </w:p>
-    <w:p>
-      <w:pPr>
-        <w:pStyle w:val="FirstParagraph"/>
-      </w:pPr>
-      <w:r>
-        <w:t>The principal implication of this study extends beyond perioperative oral care. Universal insurance coverage did not necessarily translate into need-based delivery of evidence-based care. POFM provision varied 2.25-fold across prefectures, was not associated with cancer surgery density, was most strongly correlated with dentist density (r = 0.617, p &lt; 0.0001), and showed positive spatial autocorrelation.</w:t>
-      </w:r>
-    </w:p>
-    <w:p>
-      <w:pPr>
-        <w:pStyle w:val="2"/>
-      </w:pPr>
-      <w:bookmarkStart w:id="21" w:name="X0e0375f1f85cf4a79257867a1fdb80c684492f3"/>
-      <w:bookmarkEnd w:id="20"/>
-      <w:r>
-        <w:t>4.2 Healthcare Reimbursement Does Not Equal Healthcare Implementation</w:t>
-      </w:r>
-    </w:p>
-    <w:p>
-      <w:pPr>
-        <w:pStyle w:val="FirstParagraph"/>
-      </w:pPr>
-      <w:r>
-        <w:t xml:space="preserve">Coverage is necessary but insufficient for equitable delivery. Japan’s fee schedule creates a national reimbursement pathway for POFM, yet claim density differed more than twofold and was not aligned with regional cancer surgery density. This pattern is consistent with unwarranted variation and supply-sensitive care, where local capacity and practice infrastructure shape use even when insurance coverage is broad </w:t>
+        <w:t xml:space="preserve">First, dental workforce capacity is central. Dentist density showed the strongest bivariate association with POFM density (r = 0.617, p &lt; 0.0001; Appendix Figure A2). HH clusters generally had average or above-average dentist density, whereas Okinawa, an LL cluster, had among the lowest dentist densities in Japan [19]. National surveys also show uneven hospital dentist employment, dental referral patterns, perioperative oral care capacity, and dental hygienist roles across facilities </w:t>
       </w:r>
       <w:r>
         <w:rPr>
@@ -915,13 +1040,13 @@
         <w:t>[</w:t>
       </w:r>
       <w:r>
-        <w:t>1-4</w:t>
+        <w:t>13-16,30-33</w:t>
       </w:r>
       <w:r>
         <w:t>]</w:t>
       </w:r>
       <w:r>
-        <w:t>. POFM may therefore serve as a signal of whether regional systems can implement an evidence-based perioperative service.</w:t>
+        <w:t>.</w:t>
       </w:r>
     </w:p>
     <w:p>
@@ -929,7 +1054,17 @@
         <w:pStyle w:val="a0"/>
       </w:pPr>
       <w:r>
-        <w:t>This interpretation does not imply that need is irrelevant; rather, the available cancer surgery measure should be viewed as an incomplete proxy for POFM-eligible clinical need.</w:t>
+        <w:t>Second, multidisciplinary infrastructure, including oral medicine specialists, dental representation in cancer care, and standardi</w:t>
+      </w:r>
+      <w:r>
+        <w:rPr>
+          <w:rFonts w:hint="eastAsia"/>
+          <w:lang w:eastAsia="ja-JP"/>
+        </w:rPr>
+        <w:t>z</w:t>
+      </w:r>
+      <w:r>
+        <w:t>ed referral protocols, can facilitate POFM implementation even where surgical caseload is not high [16,28].</w:t>
       </w:r>
     </w:p>
     <w:p>
@@ -937,7 +1072,39 @@
         <w:pStyle w:val="a0"/>
       </w:pPr>
       <w:r>
-        <w:t xml:space="preserve">Even so, the observed pattern is difficult to explain by need alone. Supply-side capacity, including hospital dental departments, trained POFM providers, referral pathways, and multidisciplinary perioperative routines, may strongly influence local uptake </w:t>
+        <w:t xml:space="preserve">Third, implementation lags may follow fee-schedule revisions. Expanded reimbursement requires institutional registration, credentialled personnel, and </w:t>
+      </w:r>
+      <w:r>
+        <w:lastRenderedPageBreak/>
+        <w:t>functioning referral routes; these requirements may diffuse unevenly across regions [12,24,34].</w:t>
+      </w:r>
+    </w:p>
+    <w:p>
+      <w:pPr>
+        <w:pStyle w:val="2"/>
+      </w:pPr>
+      <w:bookmarkStart w:id="23" w:name="comparison-with-prior-studies"/>
+      <w:bookmarkEnd w:id="22"/>
+      <w:r>
+        <w:t xml:space="preserve">4.5 Comparison </w:t>
+      </w:r>
+      <w:r>
+        <w:rPr>
+          <w:rFonts w:hint="eastAsia"/>
+          <w:lang w:eastAsia="ja-JP"/>
+        </w:rPr>
+        <w:t>w</w:t>
+      </w:r>
+      <w:r>
+        <w:t>ith Prior Studies and Health Policy Implications</w:t>
+      </w:r>
+    </w:p>
+    <w:p>
+      <w:pPr>
+        <w:pStyle w:val="FirstParagraph"/>
+      </w:pPr>
+      <w:r>
+        <w:t xml:space="preserve">Prior Japanese studies have examined POFM mainly at the hospital or patient level and documented postoperative benefits </w:t>
       </w:r>
       <w:r>
         <w:rPr>
@@ -947,13 +1114,39 @@
         <w:t>[</w:t>
       </w:r>
       <w:r>
-        <w:t>13-15</w:t>
+        <w:t>5,7-10</w:t>
       </w:r>
       <w:r>
         <w:t>]</w:t>
       </w:r>
       <w:r>
-        <w:t>.</w:t>
+        <w:t>. This study adds a macro-level health services perspective: even nationally reimbursed evidence-based care may remain supply-sensitive. POFM may therefore function as a case study of supply-driven implementation within universal health insurance.</w:t>
+      </w:r>
+    </w:p>
+    <w:p>
+      <w:pPr>
+        <w:pStyle w:val="FirstParagraph"/>
+      </w:pPr>
+      <w:r>
+        <w:t>The implications may extend beyond perioperative oral care. Other multidisciplinary services requiring cross-professional coordination may similarly depend on local implementation capacity rather than clinical need alone.</w:t>
+      </w:r>
+    </w:p>
+    <w:p>
+      <w:pPr>
+        <w:pStyle w:val="2"/>
+      </w:pPr>
+      <w:bookmarkStart w:id="24" w:name="strengths-and-limitations"/>
+      <w:bookmarkEnd w:id="23"/>
+      <w:r>
+        <w:t>4.6 Strengths and Limitations</w:t>
+      </w:r>
+    </w:p>
+    <w:p>
+      <w:pPr>
+        <w:pStyle w:val="FirstParagraph"/>
+      </w:pPr>
+      <w:r>
+        <w:t>Strengths: The NDB Open Data provide nationwide prefecture-level aggregate claims for Japan [17,18]. The analysis combined sensitivity specifications, spatial methods, and national dental workforce data to evaluate a claims-based signal of supply-sensitive implementation.</w:t>
       </w:r>
     </w:p>
     <w:p>
@@ -961,7 +1154,7 @@
         <w:pStyle w:val="a0"/>
       </w:pPr>
       <w:r>
-        <w:t>Historical implementation momentum may also matter. Early-adopting prefectures or university hospitals may have maintained higher utili</w:t>
+        <w:t>Limitations: First, ecological analyses cannot support individual-level inference [35,36]. Second, POFM claim density captures utili</w:t>
       </w:r>
       <w:r>
         <w:rPr>
@@ -971,17 +1164,17 @@
         <w:t>z</w:t>
       </w:r>
       <w:r>
-        <w:t>ation through accumulated expertise and referral routines, consistent with diffusion of healthcare innovations [24,25].</w:t>
+        <w:t>ation intensity, not the proportion of eligible patients receiving care. Third, cancer surgery K-codes capture only part of the POFM-eligible population, which may attenuate demand-implementation associations. Fourth, key supply-side variables, including hospital dental department density, cancer-designated hospital capacity, dental school outreach, and referral pathways, were unavailable in open prefecture-level data. Fifth, the cross-sectional design and fixed resolution of 47 prefectures limit causal inference and statistical power; the null finding should be interpreted as no detectable association at this aggregate level, not proof that surgical need is unrelated to delivery. Finally, median neighborhood weights for two island prefectures may marginally influence spatial estimates.</w:t>
       </w:r>
     </w:p>
     <w:p>
       <w:pPr>
         <w:pStyle w:val="2"/>
       </w:pPr>
-      <w:bookmarkStart w:id="22" w:name="spatial-regression-and-lisa-clustering"/>
-      <w:bookmarkEnd w:id="21"/>
-      <w:r>
-        <w:t>4.3 Spatial Diffusion of Supply-Driven Implementation</w:t>
+      <w:bookmarkStart w:id="25" w:name="policy-implications"/>
+      <w:bookmarkEnd w:id="24"/>
+      <w:r>
+        <w:t>4.7 Policy Implications: Coverage Alone Does Not Ensure Equitable Implementation</w:t>
       </w:r>
     </w:p>
     <w:p>
@@ -989,37 +1182,19 @@
         <w:pStyle w:val="FirstParagraph"/>
       </w:pPr>
       <w:r>
-        <w:t xml:space="preserve">The significant spatial autoregressive coefficient (ρ = 0.354, p = 0.002) indicates that POFM uptake was spatially patterned. This is compatible with regional diffusion </w:t>
+        <w:t xml:space="preserve">Coverage alone does not ensure equitable implementation; implementation capacity matters. Substantial variation and LL clusters suggest that reimbursement should be paired with supply-side strengthening, including hospital-dental collaboration, workforce training, referral pathway development, and inter-prefectural knowledge transfer [12,14]. More broadly, financing reforms alone may be insufficient when local </w:t>
       </w:r>
       <w:r>
         <w:lastRenderedPageBreak/>
-        <w:t>through professional networks, dental school outreach, and shared hospital dentistry staff pools, although these mechanisms were not directly measured [14,16,25,26].</w:t>
-      </w:r>
-    </w:p>
-    <w:p>
-      <w:pPr>
-        <w:pStyle w:val="a0"/>
-      </w:pPr>
-      <w:r>
-        <w:t>The SLM fit better than OLS (ΔAIC = -6.0; pseudo-R² = 0.350 vs. OLS R² = 0.197), supporting the importance of spatial dependence in prefecture-level utilisation analyses [21]. Cancer surgery density remained non-significant in the SLM, again indicating that this demand proxy alone did not explain POFM provision.</w:t>
-      </w:r>
-    </w:p>
-    <w:p>
-      <w:pPr>
-        <w:pStyle w:val="a0"/>
-      </w:pPr>
-      <w:r>
-        <w:t>LISA locali</w:t>
-      </w:r>
-      <w:r>
-        <w:rPr>
-          <w:rFonts w:hint="eastAsia"/>
-          <w:lang w:eastAsia="ja-JP"/>
-        </w:rPr>
-        <w:t>z</w:t>
-      </w:r>
-      <w:r>
-        <w:t xml:space="preserve">ed the spatial signal to HH clusters in Hyogo, Okayama, and Saga, and LL clusters in Hokkaido, Iwate, and Okinawa (Figure 6). These patterns are compatible with established medical-dental collaboration in some western regions and more constrained healthcare access in peripheral areas </w:t>
+        <w:t>implementation capacity remains heterogeneous. Monitoring claims-based regional variation can identify evidence-based services that are formally covered but not yet delivered in a need-aligned manner.</w:t>
+      </w:r>
+    </w:p>
+    <w:p>
+      <w:pPr>
+        <w:pStyle w:val="FirstParagraph"/>
+      </w:pPr>
+      <w:r>
+        <w:t xml:space="preserve">Beyond Japan, these findings carry implications for health systems considering the introduction of perioperative oral care reimbursement. As POFM efficacy in reducing postoperative complications is well established </w:t>
       </w:r>
       <w:r>
         <w:rPr>
@@ -1029,23 +1204,23 @@
         <w:t>[</w:t>
       </w:r>
       <w:r>
-        <w:t>16,25,27-29</w:t>
+        <w:t>5–11</w:t>
       </w:r>
       <w:r>
         <w:t>]</w:t>
       </w:r>
       <w:r>
-        <w:t>.</w:t>
+        <w:t>, reimbursement may increasingly be adopted internationally. However, this study suggests that coverage alone may be insufficient: parallel investment in dental workforce development, hospital-dental integration, referral pathway infrastructure, and multidisciplinary care routines may be equally necessary to translate formal eligibility into equitable access to evidence-based perioperative care.</w:t>
       </w:r>
     </w:p>
     <w:p>
       <w:pPr>
         <w:pStyle w:val="2"/>
       </w:pPr>
-      <w:bookmarkStart w:id="23" w:name="X27902cb60bc071ff410ed64cb6a261fb90dbf71"/>
-      <w:bookmarkEnd w:id="22"/>
-      <w:r>
-        <w:t>4.4 Supply-Side Determinants of Need-Based POFM Delivery</w:t>
+      <w:bookmarkStart w:id="26" w:name="conclusions"/>
+      <w:bookmarkEnd w:id="25"/>
+      <w:r>
+        <w:t>4.8 Conclusions</w:t>
       </w:r>
     </w:p>
     <w:p>
@@ -1053,227 +1228,12 @@
         <w:pStyle w:val="FirstParagraph"/>
       </w:pPr>
       <w:r>
-        <w:t>The findings point to supply-side capacity as a plausible driver of POFM provision (Figure 1). Three mechanisms are relevant.</w:t>
-      </w:r>
-    </w:p>
-    <w:p>
-      <w:pPr>
-        <w:pStyle w:val="a0"/>
-      </w:pPr>
-      <w:r>
-        <w:t xml:space="preserve">First, dental workforce capacity is central. Dentist density showed the strongest bivariate association with POFM density (r = 0.617, p &lt; 0.0001; Figure 2). HH clusters generally had average or above-average dentist density, whereas Okinawa, an LL cluster, had among the lowest dentist densities in Japan [19]. National surveys also show uneven hospital dentist employment, dental referral patterns, perioperative oral care capacity, and dental hygienist roles across facilities </w:t>
-      </w:r>
-      <w:r>
-        <w:rPr>
-          <w:rFonts w:hint="eastAsia"/>
-          <w:lang w:eastAsia="ja-JP"/>
-        </w:rPr>
-        <w:t>[</w:t>
-      </w:r>
-      <w:r>
-        <w:t>13-16,30-33</w:t>
-      </w:r>
-      <w:r>
-        <w:t>]</w:t>
-      </w:r>
-      <w:r>
-        <w:t>.</w:t>
-      </w:r>
-    </w:p>
-    <w:p>
-      <w:pPr>
-        <w:pStyle w:val="a0"/>
-      </w:pPr>
-      <w:r>
-        <w:rPr>
-          <w:i/>
-          <w:iCs/>
-        </w:rPr>
-        <w:t>(See Appendix Figure A2)</w:t>
-      </w:r>
-    </w:p>
-    <w:p>
-      <w:pPr>
-        <w:pStyle w:val="a0"/>
-      </w:pPr>
-      <w:r>
-        <w:t>Second, multidisciplinary infrastructure, including oral medicine specialists, dental representation in cancer care, and standardi</w:t>
-      </w:r>
-      <w:r>
-        <w:rPr>
-          <w:rFonts w:hint="eastAsia"/>
-          <w:lang w:eastAsia="ja-JP"/>
-        </w:rPr>
-        <w:t>z</w:t>
-      </w:r>
-      <w:r>
-        <w:t>ed referral protocols, can facilitate POFM implementation even where surgical caseload is not high [16,28].</w:t>
-      </w:r>
-    </w:p>
-    <w:p>
-      <w:pPr>
-        <w:pStyle w:val="a0"/>
-      </w:pPr>
-      <w:r>
-        <w:t>Third, implementation lags may follow fee-schedule revisions. Expanded reimbursement requires institutional registration, credentialled personnel, and functioning referral routes; these requirements may diffuse unevenly across regions [12,24,34].</w:t>
-      </w:r>
-    </w:p>
-    <w:p>
-      <w:pPr>
-        <w:pStyle w:val="2"/>
-      </w:pPr>
-      <w:bookmarkStart w:id="24" w:name="comparison-with-prior-studies"/>
-      <w:bookmarkEnd w:id="23"/>
-      <w:r>
-        <w:t xml:space="preserve">4.5 Comparison </w:t>
-      </w:r>
-      <w:r>
-        <w:rPr>
-          <w:rFonts w:hint="eastAsia"/>
-          <w:lang w:eastAsia="ja-JP"/>
-        </w:rPr>
-        <w:t>w</w:t>
-      </w:r>
-      <w:r>
-        <w:t>ith Prior Studies and Health Policy Implications</w:t>
-      </w:r>
-    </w:p>
-    <w:p>
-      <w:pPr>
-        <w:pStyle w:val="FirstParagraph"/>
-      </w:pPr>
-      <w:r>
-        <w:t xml:space="preserve">Prior Japanese studies have examined POFM mainly at the hospital or patient level and documented postoperative benefits </w:t>
-      </w:r>
-      <w:r>
-        <w:rPr>
-          <w:rFonts w:hint="eastAsia"/>
-          <w:lang w:eastAsia="ja-JP"/>
-        </w:rPr>
-        <w:t>[</w:t>
-      </w:r>
-      <w:r>
-        <w:t>5,7-10</w:t>
-      </w:r>
-      <w:r>
-        <w:t>]</w:t>
-      </w:r>
-      <w:r>
-        <w:t>. This study adds a macro-level health services perspective: even nationally reimbursed evidence-based care may remain supply-sensitive. POFM may therefore function as a case study of supply-driven implementation within universal health insurance.</w:t>
-      </w:r>
-    </w:p>
-    <w:p>
-      <w:pPr>
-        <w:pStyle w:val="FirstParagraph"/>
-      </w:pPr>
-      <w:r>
-        <w:lastRenderedPageBreak/>
-        <w:t>The implications may extend beyond perioperative oral care. Other multidisciplinary services requiring cross-professional coordination may similarly depend on local implementation capacity rather than clinical need alone.</w:t>
-      </w:r>
-    </w:p>
-    <w:p>
-      <w:pPr>
-        <w:pStyle w:val="2"/>
-      </w:pPr>
-      <w:bookmarkStart w:id="25" w:name="strengths-and-limitations"/>
-      <w:bookmarkEnd w:id="24"/>
-      <w:r>
-        <w:t>4.6 Strengths and Limitations</w:t>
-      </w:r>
-    </w:p>
-    <w:p>
-      <w:pPr>
-        <w:pStyle w:val="FirstParagraph"/>
-      </w:pPr>
-      <w:r>
-        <w:t>Strengths: The NDB Open Data provide nationwide prefecture-level aggregate claims for Japan [17,18]. The analysis combined sensitivity specifications, spatial methods, and national dental workforce data to evaluate a claims-based signal of supply-sensitive implementation.</w:t>
-      </w:r>
-    </w:p>
-    <w:p>
-      <w:pPr>
-        <w:pStyle w:val="a0"/>
-      </w:pPr>
-      <w:r>
-        <w:t>Limitations: First, ecological analyses cannot support individual-level inference [35,36]. Second, POFM claim density captures utili</w:t>
-      </w:r>
-      <w:r>
-        <w:rPr>
-          <w:rFonts w:hint="eastAsia"/>
-          <w:lang w:eastAsia="ja-JP"/>
-        </w:rPr>
-        <w:t>z</w:t>
-      </w:r>
-      <w:r>
-        <w:t>ation intensity, not the proportion of eligible patients receiving care. Third, cancer surgery K-codes capture only part of the POFM-eligible population, which may attenuate demand-implementation associations. Fourth, key supply-side variables, including hospital dental department density, cancer-designated hospital capacity, dental school outreach, and referral pathways, were unavailable in open prefecture-level data. Fifth, the cross-sectional design and fixed resolution of 47 prefectures limit causal inference and statistical power; the null finding should be interpreted as no detectable association at this aggregate level, not proof that surgical need is unrelated to delivery. Finally, median neighborhood weights for two island prefectures may marginally influence spatial estimates.</w:t>
-      </w:r>
-    </w:p>
-    <w:p>
-      <w:pPr>
-        <w:pStyle w:val="2"/>
-      </w:pPr>
-      <w:bookmarkStart w:id="26" w:name="policy-implications"/>
-      <w:bookmarkEnd w:id="25"/>
-      <w:r>
-        <w:t>4.7 Policy Implications: Coverage Alone Does Not Ensure Equitable Implementation</w:t>
-      </w:r>
-    </w:p>
-    <w:p>
-      <w:pPr>
-        <w:pStyle w:val="FirstParagraph"/>
-      </w:pPr>
-      <w:r>
-        <w:t>Coverage alone does not ensure equitable implementation; implementation capacity matters. Substantial variation and LL clusters suggest that reimbursement should be paired with supply-side strengthening, including hospital-dental collaboration, workforce training, referral pathway development, and inter-prefectural knowledge transfer [12,14]. More broadly, financing reforms alone may be insufficient when local implementation capacity remains heterogeneous. Monitoring claims-based regional variation can identify evidence-based services that are formally covered but not yet delivered in a need-aligned manner.</w:t>
-      </w:r>
-    </w:p>
-    <w:p>
-      <w:pPr>
-        <w:pStyle w:val="FirstParagraph"/>
-      </w:pPr>
-      <w:r>
-        <w:t xml:space="preserve">Beyond Japan, these findings carry implications for health systems considering the introduction of perioperative oral care reimbursement. As POFM efficacy in reducing postoperative complications is well established </w:t>
-      </w:r>
-      <w:r>
-        <w:rPr>
-          <w:rFonts w:hint="eastAsia"/>
-          <w:lang w:eastAsia="ja-JP"/>
-        </w:rPr>
-        <w:t>[</w:t>
-      </w:r>
-      <w:r>
-        <w:t>5–11</w:t>
-      </w:r>
-      <w:r>
-        <w:t>]</w:t>
-      </w:r>
-      <w:r>
-        <w:t xml:space="preserve">, reimbursement may increasingly be adopted internationally. However, this study suggests that coverage alone may be insufficient: parallel investment in dental workforce development, hospital-dental integration, referral pathway infrastructure, and multidisciplinary care </w:t>
-      </w:r>
-      <w:r>
-        <w:lastRenderedPageBreak/>
-        <w:t>routines may be equally necessary to translate formal eligibility into equitable access to evidence-based perioperative care.</w:t>
-      </w:r>
-    </w:p>
-    <w:p>
-      <w:pPr>
-        <w:pStyle w:val="2"/>
-      </w:pPr>
-      <w:bookmarkStart w:id="27" w:name="conclusions"/>
-      <w:bookmarkEnd w:id="26"/>
-      <w:r>
-        <w:t>4.8 Conclusions</w:t>
-      </w:r>
-    </w:p>
-    <w:p>
-      <w:pPr>
-        <w:pStyle w:val="FirstParagraph"/>
-      </w:pPr>
-      <w:r>
         <w:t>This ecological analysis demonstrated substantial prefectural variation in POFM provision in Japan, which was not explained by regional cancer surgical demand. POFM appears more supply-driven than need-driven, with dental workforce capacity, hospital-dental integration, and regional professional networks shaping implementation. These findings suggest that universal health insurance does not necessarily guarantee need-based delivery of evidence-based care. POFM may represent a case study of supply-sensitive implementation under universal coverage, with implications for healthcare systems seeking to translate coverage into equitable access to evidence-based care.</w:t>
       </w:r>
     </w:p>
     <w:p>
       <w:r>
-        <w:pict w14:anchorId="2F0E4AC1">
+        <w:pict w14:anchorId="0D795C79">
           <v:rect id="_x0000_i1029" style="width:0;height:1.5pt" o:hralign="center" o:hrstd="t" o:hr="t"/>
         </w:pict>
       </w:r>
@@ -1282,11 +1242,29 @@
       <w:pPr>
         <w:pStyle w:val="1"/>
       </w:pPr>
-      <w:bookmarkStart w:id="28" w:name="acknowledgments"/>
-      <w:bookmarkEnd w:id="19"/>
+      <w:bookmarkStart w:id="27" w:name="acknowledgments"/>
+      <w:bookmarkEnd w:id="18"/>
+      <w:bookmarkEnd w:id="26"/>
+      <w:r>
+        <w:t>Acknowledgments</w:t>
+      </w:r>
+    </w:p>
+    <w:p>
+      <w:pPr>
+        <w:pStyle w:val="FirstParagraph"/>
+      </w:pPr>
+      <w:r>
+        <w:t>The authors thank the Ministry of Health, Labour and Welfare of Japan for providing access to the NDB Open Data. All data used are publicly available aggregate statistics.</w:t>
+      </w:r>
+    </w:p>
+    <w:p>
+      <w:pPr>
+        <w:pStyle w:val="1"/>
+      </w:pPr>
+      <w:bookmarkStart w:id="28" w:name="conflicts-of-interest"/>
       <w:bookmarkEnd w:id="27"/>
       <w:r>
-        <w:t>Acknowledgments</w:t>
+        <w:t>Conflicts of Interest</w:t>
       </w:r>
     </w:p>
     <w:p>
@@ -1294,17 +1272,17 @@
         <w:pStyle w:val="FirstParagraph"/>
       </w:pPr>
       <w:r>
-        <w:t>The authors thank the Ministry of Health, Labour and Welfare of Japan for providing access to the NDB Open Data. All data used are publicly available aggregate statistics.</w:t>
+        <w:t>The authors declare no conflicts of interest.</w:t>
       </w:r>
     </w:p>
     <w:p>
       <w:pPr>
         <w:pStyle w:val="1"/>
       </w:pPr>
-      <w:bookmarkStart w:id="29" w:name="conflicts-of-interest"/>
+      <w:bookmarkStart w:id="29" w:name="data-availability"/>
       <w:bookmarkEnd w:id="28"/>
       <w:r>
-        <w:t>Conflicts of Interest</w:t>
+        <w:t>Data Availability</w:t>
       </w:r>
     </w:p>
     <w:p>
@@ -1312,33 +1290,19 @@
         <w:pStyle w:val="FirstParagraph"/>
       </w:pPr>
       <w:r>
-        <w:t>The authors declare no conflicts of interest.</w:t>
+        <w:t xml:space="preserve">The NDB Open Data used in this analysis are publicly available from the Ministry of Health, Labour and Welfare of Japan </w:t>
+      </w:r>
+      <w:r>
+        <w:lastRenderedPageBreak/>
+        <w:t>(https://www.mhlw.go.jp/stf/seisakunitsuite/bunya/0000177182.html). Analysis code is available at https://github.com/haruki00430/NDB_POFM and archived on Zenodo (https://doi.org/10.5281/zenodo.20827647).</w:t>
       </w:r>
     </w:p>
     <w:p>
       <w:pPr>
         <w:pStyle w:val="1"/>
       </w:pPr>
-      <w:bookmarkStart w:id="30" w:name="data-availability"/>
+      <w:bookmarkStart w:id="30" w:name="author-contributions"/>
       <w:bookmarkEnd w:id="29"/>
-      <w:r>
-        <w:t>Data Availability</w:t>
-      </w:r>
-    </w:p>
-    <w:p>
-      <w:pPr>
-        <w:pStyle w:val="FirstParagraph"/>
-      </w:pPr>
-      <w:r>
-        <w:t>The NDB Open Data used in this analysis are publicly available from the Ministry of Health, Labour and Welfare of Japan (https://www.mhlw.go.jp/stf/seisakunitsuite/bunya/0000177182.html). Analysis code is available at https://github.com/haruki00430/NDB_POFM and archived on Zenodo (https://doi.org/10.5281/zenodo.20827647).</w:t>
-      </w:r>
-    </w:p>
-    <w:p>
-      <w:pPr>
-        <w:pStyle w:val="1"/>
-      </w:pPr>
-      <w:bookmarkStart w:id="31" w:name="author-contributions"/>
-      <w:bookmarkEnd w:id="30"/>
       <w:r>
         <w:t>Author Contributions</w:t>
       </w:r>
@@ -1375,8 +1339,8 @@
           <w:lang w:eastAsia="ja-JP"/>
         </w:rPr>
       </w:pPr>
-      <w:bookmarkStart w:id="32" w:name="funding"/>
-      <w:bookmarkEnd w:id="31"/>
+      <w:bookmarkStart w:id="31" w:name="funding"/>
+      <w:bookmarkEnd w:id="30"/>
       <w:r>
         <w:t>Funding</w:t>
       </w:r>
@@ -1423,7 +1387,7 @@
         <w:t>Gemini 3 Pro (Google). These tools were used only for text drafting and code generation; no generative AI or AI-assisted tools were used to create, alter, or otherwise process any figures, images, or artwork in this manuscript. The authors reviewed and edited all AI-assisted outputs and were responsible for the study design, selection of statistical methods, interpretation of findings, conclusions, and final reference list. The authors take full responsibility for the integrity and accuracy of the final content. AI was not listed as an author.</w:t>
       </w:r>
       <w:r>
-        <w:pict w14:anchorId="5256ACE6">
+        <w:pict w14:anchorId="03DD40FD">
           <v:rect id="_x0000_i1030" style="width:0;height:1.5pt" o:hralign="center" o:hrstd="t" o:hr="t"/>
         </w:pict>
       </w:r>
@@ -1432,8 +1396,8 @@
       <w:pPr>
         <w:pStyle w:val="1"/>
       </w:pPr>
-      <w:bookmarkStart w:id="33" w:name="references"/>
-      <w:bookmarkEnd w:id="32"/>
+      <w:bookmarkStart w:id="32" w:name="references"/>
+      <w:bookmarkEnd w:id="31"/>
       <w:r>
         <w:t>References</w:t>
       </w:r>
@@ -1459,6 +1423,7 @@
         <w:pStyle w:val="a9"/>
       </w:pPr>
       <w:r>
+        <w:lastRenderedPageBreak/>
         <w:t>3. Fisher ES, Wennberg DE, Stukel TA, Gottlieb DJ, Lucas FL, Pinder EL. The implications of regional variations in Medicare spending. Part 1: The content, quality, and accessibility of care. Ann Intern Med. 2003;138(4):273-87. doi:10.7326/0003-4819-138-4-200302180-00006.</w:t>
       </w:r>
     </w:p>
@@ -1474,339 +1439,335 @@
       <w:pPr>
         <w:pStyle w:val="a9"/>
       </w:pPr>
-      <w:bookmarkStart w:id="34" w:name="ref-Ishimaru2018"/>
-      <w:bookmarkStart w:id="35" w:name="refs"/>
+      <w:bookmarkStart w:id="33" w:name="ref-Ishimaru2018"/>
+      <w:bookmarkStart w:id="34" w:name="refs"/>
+      <w:r>
+        <w:t>5. Ishimaru M, Matsui H, Ono S, Hagiwara Y, Morita K, Yasunaga H. Preoperative oral care and effect on postoperative complications after major cancer surgery. Br J Surg. 2018;105(12):1688-96. Available from: https://pubmed.ncbi.nlm.nih.gov/30088267/</w:t>
+      </w:r>
+    </w:p>
+    <w:p>
+      <w:pPr>
+        <w:pStyle w:val="a9"/>
+      </w:pPr>
+      <w:bookmarkStart w:id="35" w:name="ref-CamusJansson2023"/>
+      <w:bookmarkEnd w:id="33"/>
+      <w:r>
+        <w:t>6. Camus-Jansson F, Longueira-Diaz N, Salinas-Diaz B, Granic-Chinchon A, Cueto-Urbina W, Parra-Parra M, et al. Preoperative oral practices and incidence of postoperative complications in hospital medical-surgical procedures: A meta-analysis. Med Oral Patol Oral Cir Bucal. 2023;28(3):e217-28. Available from: https://pubmed.ncbi.nlm.nih.gov/37026607/</w:t>
+      </w:r>
+    </w:p>
+    <w:p>
+      <w:pPr>
+        <w:pStyle w:val="a9"/>
+      </w:pPr>
+      <w:bookmarkStart w:id="36" w:name="ref-Shin2019"/>
+      <w:bookmarkEnd w:id="35"/>
+      <w:r>
+        <w:t>7. Shin JH, Kunisawa S, Fushimi K, Imanaka Y. Effects of preoperative oral management by dentists on postoperative outcomes following esophagectomy: Multilevel propensity score matching and weighting analyses using the Japanese inpatient database. Medicine (Baltimore). 2019;98(17):e15376. Available from: https://pubmed.ncbi.nlm.nih.gov/31027127/</w:t>
+      </w:r>
+    </w:p>
+    <w:p>
+      <w:pPr>
+        <w:pStyle w:val="a9"/>
+      </w:pPr>
+      <w:bookmarkStart w:id="37" w:name="ref-Soutome2017"/>
+      <w:bookmarkEnd w:id="36"/>
+      <w:r>
+        <w:t>8. Soutome S, Yanamoto S, Funahara M, Hasegawa T, Komori T, Yamada SI, et al. Effect of perioperative oral care on prevention of postoperative pneumonia associated with esophageal cancer surgery: A multicenter case-control study with propensity score matching analysis. Medicine (Baltimore). 2017;96(33):e7436. Available from: https://pubmed.ncbi.nlm.nih.gov/28816937/</w:t>
+      </w:r>
+    </w:p>
+    <w:p>
+      <w:pPr>
+        <w:pStyle w:val="a9"/>
+      </w:pPr>
+      <w:bookmarkStart w:id="38" w:name="ref-Iwata2019"/>
+      <w:bookmarkEnd w:id="37"/>
+      <w:r>
+        <w:t>9. Iwata E, Hasegawa T, Yamada SI, Kawashita Y, Yoshimatsu M, Mizutani T, et al. Effects of perioperative oral care on prevention of postoperative pneumonia after lung resection: Multicenter retrospective study with propensity score matching analysis. Surgery. 2019;165(5):1003-7. Available from: https://pubmed.ncbi.nlm.nih.gov/30765141/</w:t>
+      </w:r>
+    </w:p>
+    <w:p>
+      <w:pPr>
+        <w:pStyle w:val="a9"/>
+      </w:pPr>
+      <w:bookmarkStart w:id="39" w:name="ref-Nobuhara2018"/>
+      <w:bookmarkEnd w:id="38"/>
+      <w:r>
+        <w:t>10. Nobuhara H, Yanamoto S, Funahara M, Matsugu Y, Hayashida S, Soutome S, et al. Effect of perioperative oral management on the prevention of surgical site infection after colorectal cancer surgery: A multicenter retrospective analysis of 698 patients via analysis of covariance using propensity score. Medicine (Baltimore). 2018;97(40):e12545. Available from: https://pubmed.ncbi.nlm.nih.gov/30290611/</w:t>
+      </w:r>
+    </w:p>
+    <w:p>
+      <w:pPr>
+        <w:pStyle w:val="a9"/>
+      </w:pPr>
+      <w:bookmarkStart w:id="40" w:name="ref-Duan2025"/>
+      <w:bookmarkEnd w:id="39"/>
       <w:r>
         <w:lastRenderedPageBreak/>
-        <w:t>5. Ishimaru M, Matsui H, Ono S, Hagiwara Y, Morita K, Yasunaga H. Preoperative oral care and effect on postoperative complications after major cancer surgery. Br J Surg. 2018;105(12):1688-96. Available from: https://pubmed.ncbi.nlm.nih.gov/30088267/</w:t>
+        <w:t>11. Duan L, Li D, Li Z, Luo W, Chu X. Effect of perioperative oral care on postoperative pneumonia in thoracic surgery patients: A systematic review and meta-analysis. Sci Rep. 2025 Dec 5;16(1):951. doi:10.1038/s41598-025-30492-6.</w:t>
       </w:r>
     </w:p>
     <w:p>
       <w:pPr>
         <w:pStyle w:val="a9"/>
       </w:pPr>
-      <w:bookmarkStart w:id="36" w:name="ref-CamusJansson2023"/>
-      <w:bookmarkEnd w:id="34"/>
-      <w:r>
-        <w:t>6. Camus-Jansson F, Longueira-Diaz N, Salinas-Diaz B, Granic-Chinchon A, Cueto-Urbina W, Parra-Parra M, et al. Preoperative oral practices and incidence of postoperative complications in hospital medical-surgical procedures: A meta-analysis. Med Oral Patol Oral Cir Bucal. 2023;28(3):e217-28. Available from: https://pubmed.ncbi.nlm.nih.gov/37026607/</w:t>
+      <w:bookmarkStart w:id="41" w:name="ref-MHLW2022"/>
+      <w:bookmarkEnd w:id="40"/>
+      <w:r>
+        <w:t>12. Ministry of Health, Labour and Welfare. Medical fee schedule revision for fiscal year 2022 (Reiwa 4). 2022. Available from: https://www.mhlw.go.jp/stf/seisakunitsuite/bunya/0000188411_00037.html</w:t>
       </w:r>
     </w:p>
     <w:p>
       <w:pPr>
         <w:pStyle w:val="a9"/>
       </w:pPr>
-      <w:bookmarkStart w:id="37" w:name="ref-Shin2019"/>
-      <w:bookmarkEnd w:id="36"/>
-      <w:r>
-        <w:t>7. Shin JH, Kunisawa S, Fushimi K, Imanaka Y. Effects of preoperative oral management by dentists on postoperative outcomes following esophagectomy: Multilevel propensity score matching and weighting analyses using the Japanese inpatient database. Medicine (Baltimore). 2019;98(17):e15376. Available from: https://pubmed.ncbi.nlm.nih.gov/31027127/</w:t>
+      <w:bookmarkStart w:id="42" w:name="ref-Kodama2021"/>
+      <w:bookmarkEnd w:id="41"/>
+      <w:r>
+        <w:t>13. Kodama T, Ida Y, Oshima K, Miura H. Are public oral care services evenly distributed? Nation-wide assessment of the provision of oral care in Japan using the national database of health insurance claims. Int J Environ Res Public Health. 2021;18(20):10850.</w:t>
       </w:r>
     </w:p>
     <w:p>
       <w:pPr>
         <w:pStyle w:val="a9"/>
       </w:pPr>
-      <w:bookmarkStart w:id="38" w:name="ref-Soutome2017"/>
-      <w:bookmarkEnd w:id="37"/>
-      <w:r>
-        <w:t>8. Soutome S, Yanamoto S, Funahara M, Hasegawa T, Komori T, Yamada SI, et al. Effect of perioperative oral care on prevention of postoperative pneumonia associated with esophageal cancer surgery: A multicenter case-control study with propensity score matching analysis. Medicine (Baltimore). 2017;96(33):e7436. Available from: https://pubmed.ncbi.nlm.nih.gov/28816937/</w:t>
+      <w:bookmarkStart w:id="43" w:name="ref-Ishimaru2022b"/>
+      <w:bookmarkEnd w:id="42"/>
+      <w:r>
+        <w:t>14. Ishimaru M, Taira K, Zaitsu T, Inoue Y, Kino S, Takahashi H, et al. Characteristics of hospitals employing dentists, and utilization of dental care services for hospitalized patients in Japan: A nationwide cross-sectional study. Int J Environ Res Public Health. 2022;19(11):6448.</w:t>
       </w:r>
     </w:p>
     <w:p>
       <w:pPr>
         <w:pStyle w:val="a9"/>
       </w:pPr>
-      <w:bookmarkStart w:id="39" w:name="ref-Iwata2019"/>
-      <w:bookmarkEnd w:id="38"/>
-      <w:r>
-        <w:t>9. Iwata E, Hasegawa T, Yamada SI, Kawashita Y, Yoshimatsu M, Mizutani T, et al. Effects of perioperative oral care on prevention of postoperative pneumonia after lung resection: Multicenter retrospective study with propensity score matching analysis. Surgery. 2019;165(5):1003-7. Available from: https://pubmed.ncbi.nlm.nih.gov/30765141/</w:t>
+      <w:bookmarkStart w:id="44" w:name="ref-Nomura2021"/>
+      <w:bookmarkEnd w:id="43"/>
+      <w:r>
+        <w:t>15. Nomura Y, Ohara Y, Yamamoto Y, Okada A, Hosoya N, Hanada N, et al. Dental hygienists’ practice in perioperative oral care management according to the Japanese dental hygienists survey 2019. Int J Environ Res Public Health. 2021;18(1):114. Available from: https://pubmed.ncbi.nlm.nih.gov/33375276/</w:t>
       </w:r>
     </w:p>
     <w:p>
       <w:pPr>
         <w:pStyle w:val="a9"/>
       </w:pPr>
-      <w:bookmarkStart w:id="40" w:name="ref-Nobuhara2018"/>
-      <w:bookmarkEnd w:id="39"/>
-      <w:r>
-        <w:t>10. Nobuhara H, Yanamoto S, Funahara M, Matsugu Y, Hayashida S, Soutome S, et al. Effect of perioperative oral management on the prevention of surgical site infection after colorectal cancer surgery: A multicenter retrospective analysis of 698 patients via analysis of covariance using propensity score. Medicine (Baltimore). 2018;97(40):e12545. Available from: https://pubmed.ncbi.nlm.nih.gov/30290611/</w:t>
+      <w:bookmarkStart w:id="45" w:name="ref-Taira2021"/>
+      <w:bookmarkEnd w:id="44"/>
+      <w:r>
+        <w:t>16. Taira K, Mori T, Ishimaru M, Iwagami M, Sakata N, Watanabe T, et al. Regional inequality in dental care utilization in Japan: An ecological study using the national database of health insurance claims. Lancet Reg Health West Pac. 2021;12:100170.</w:t>
       </w:r>
     </w:p>
     <w:p>
       <w:pPr>
         <w:pStyle w:val="a9"/>
       </w:pPr>
-      <w:bookmarkStart w:id="41" w:name="ref-Duan2025"/>
-      <w:bookmarkEnd w:id="40"/>
-      <w:r>
-        <w:t>11. Duan L, Li D, Li Z, Luo W, Chu X. Effect of perioperative oral care on postoperative pneumonia in thoracic surgery patients: A systematic review and meta-analysis. Sci Rep. 2025 Dec 5;16(1):951. doi:10.1038/s41598-025-30492-6.</w:t>
+      <w:bookmarkStart w:id="46" w:name="ref-MHLW_NDB2023"/>
+      <w:bookmarkEnd w:id="45"/>
+      <w:r>
+        <w:t>17. Ministry of Health, Labour and Welfare. National Database of Health Insurance Claims and Specific Health Checkups Open Data: 10th release. 2024. Available from: https://www.mhlw.go.jp/stf/seisakunitsuite/bunya/0000177182.html</w:t>
       </w:r>
     </w:p>
     <w:p>
       <w:pPr>
         <w:pStyle w:val="a9"/>
       </w:pPr>
-      <w:bookmarkStart w:id="42" w:name="ref-MHLW2022"/>
-      <w:bookmarkEnd w:id="41"/>
-      <w:r>
-        <w:t>12. Ministry of Health, Labour and Welfare. Medical fee schedule revision for fiscal year 2022 (Reiwa 4). 2022. Available from: https://www.mhlw.go.jp/stf/seisakunitsuite/bunya/0000188411_00037.html</w:t>
+      <w:bookmarkStart w:id="47" w:name="ref-Sato2024NDB"/>
+      <w:bookmarkEnd w:id="46"/>
+      <w:r>
+        <w:t>18. Sato S, Yasunaga H. A review of studies using Japanese nationwide administrative claims databases. Ann Clin Epidemiol. 2023;5(2):58-64. Available from: https://pubmed.ncbi.nlm.nih.gov/38505730/</w:t>
       </w:r>
     </w:p>
     <w:p>
       <w:pPr>
         <w:pStyle w:val="a9"/>
       </w:pPr>
-      <w:bookmarkStart w:id="43" w:name="ref-Kodama2021"/>
-      <w:bookmarkEnd w:id="42"/>
-      <w:r>
-        <w:t xml:space="preserve">13. Kodama T, Ida Y, Oshima K, Miura H. Are public oral care services evenly distributed? Nation-wide assessment of the provision of oral care in Japan using the </w:t>
-      </w:r>
+      <w:bookmarkStart w:id="48" w:name="ref-MHLW_DentistSurvey2022"/>
+      <w:bookmarkEnd w:id="47"/>
+      <w:r>
+        <w:t>19. Ministry of Health, Labour and Welfare. Survey of physicians, dentists and pharmacists: Reiwa 4 (2022). 2023. Available from: https://www.mhlw.go.jp/toukei/saikin/hw/ishi/22/index.html</w:t>
+      </w:r>
+    </w:p>
+    <w:p>
+      <w:pPr>
+        <w:pStyle w:val="a9"/>
+      </w:pPr>
+      <w:bookmarkStart w:id="49" w:name="ref-Anselin1995"/>
+      <w:bookmarkEnd w:id="48"/>
+      <w:r>
+        <w:t>20. Anselin L. Spatial econometrics: Methods and models. Dordrecht: Kluwer Academic Publishers; 1988.</w:t>
+      </w:r>
+    </w:p>
+    <w:p>
+      <w:pPr>
+        <w:pStyle w:val="a9"/>
+      </w:pPr>
+      <w:bookmarkStart w:id="50" w:name="ref-Anselin1988"/>
+      <w:bookmarkEnd w:id="49"/>
+      <w:r>
+        <w:t>21. LeSage JP, Pace RK. Introduction to spatial econometrics. Boca Raton: Chapman and Hall/CRC; 2009.</w:t>
+      </w:r>
+    </w:p>
+    <w:p>
+      <w:pPr>
+        <w:pStyle w:val="a9"/>
+      </w:pPr>
+      <w:bookmarkStart w:id="51" w:name="ref-LeSage2009"/>
+      <w:bookmarkEnd w:id="50"/>
       <w:r>
         <w:lastRenderedPageBreak/>
-        <w:t>national database of health insurance claims. Int J Environ Res Public Health. 2021;18(20):10850.</w:t>
+        <w:t>22. Anselin L. Local indicators of spatial association-LISA. Geogr Anal. 1995;27(2):93-115.</w:t>
       </w:r>
     </w:p>
     <w:p>
       <w:pPr>
         <w:pStyle w:val="a9"/>
       </w:pPr>
-      <w:bookmarkStart w:id="44" w:name="ref-Ishimaru2022b"/>
-      <w:bookmarkEnd w:id="43"/>
-      <w:r>
-        <w:t>14. Ishimaru M, Taira K, Zaitsu T, Inoue Y, Kino S, Takahashi H, et al. Characteristics of hospitals employing dentists, and utilization of dental care services for hospitalized patients in Japan: A nationwide cross-sectional study. Int J Environ Res Public Health. 2022;19(11):6448.</w:t>
+      <w:bookmarkStart w:id="52" w:name="ref-Cohen1988"/>
+      <w:bookmarkEnd w:id="51"/>
+      <w:r>
+        <w:t>23. Cohen J. Statistical power analysis for the behavioral sciences. 2nd ed. Hillsdale (NJ): Lawrence Erlbaum Associates; 1988.</w:t>
       </w:r>
     </w:p>
     <w:p>
       <w:pPr>
         <w:pStyle w:val="a9"/>
       </w:pPr>
-      <w:bookmarkStart w:id="45" w:name="ref-Nomura2021"/>
-      <w:bookmarkEnd w:id="44"/>
-      <w:r>
-        <w:t>15. Nomura Y, Ohara Y, Yamamoto Y, Okada A, Hosoya N, Hanada N, et al. Dental hygienists’ practice in perioperative oral care management according to the Japanese dental hygienists survey 2019. Int J Environ Res Public Health. 2021;18(1):114. Available from: https://pubmed.ncbi.nlm.nih.gov/33375276/</w:t>
+      <w:bookmarkStart w:id="53" w:name="ref-Greenhalgh2004"/>
+      <w:bookmarkEnd w:id="52"/>
+      <w:r>
+        <w:t>24. Greenhalgh T, Robert G, Macfarlane F, Bate P, Kyriakidou O. Diffusion of innovations in service organizations: Systematic review and recommendations. Milbank Q. 2004;82(4):581-629.</w:t>
       </w:r>
     </w:p>
     <w:p>
       <w:pPr>
         <w:pStyle w:val="a9"/>
       </w:pPr>
-      <w:bookmarkStart w:id="46" w:name="ref-Taira2021"/>
-      <w:bookmarkEnd w:id="45"/>
-      <w:r>
-        <w:t>16. Taira K, Mori T, Ishimaru M, Iwagami M, Sakata N, Watanabe T, et al. Regional inequality in dental care utilization in Japan: An ecological study using the national database of health insurance claims. Lancet Reg Health West Pac. 2021;12:100170.</w:t>
+      <w:bookmarkStart w:id="54" w:name="ref-Ibuka2020"/>
+      <w:bookmarkEnd w:id="53"/>
+      <w:r>
+        <w:t>25. Ibuka Y, Matsuda Y, Shoji K, Ishigaki T. Evaluation of regional variations in healthcare utilization. Jpn J Stat Data Sci. 2020;3(1):349-65.</w:t>
       </w:r>
     </w:p>
     <w:p>
       <w:pPr>
         <w:pStyle w:val="a9"/>
       </w:pPr>
-      <w:bookmarkStart w:id="47" w:name="ref-MHLW_NDB2023"/>
-      <w:bookmarkEnd w:id="46"/>
-      <w:r>
-        <w:t>17. Ministry of Health, Labour and Welfare. National Database of Health Insurance Claims and Specific Health Checkups Open Data: 10th release. 2024. Available from: https://www.mhlw.go.jp/stf/seisakunitsuite/bunya/0000177182.html</w:t>
+      <w:bookmarkStart w:id="55" w:name="ref-Seo2022"/>
+      <w:bookmarkEnd w:id="54"/>
+      <w:r>
+        <w:t>26. Seo Y, Takikawa T. Regional variation in national healthcare expenditure and health system performance in central cities and suburbs in Japan. Healthcare (Basel). 2022;10(6):968.</w:t>
       </w:r>
     </w:p>
     <w:p>
       <w:pPr>
         <w:pStyle w:val="a9"/>
       </w:pPr>
-      <w:bookmarkStart w:id="48" w:name="ref-Sato2024NDB"/>
-      <w:bookmarkEnd w:id="47"/>
-      <w:r>
-        <w:t>18. Sato S, Yasunaga H. A review of studies using Japanese nationwide administrative claims databases. Ann Clin Epidemiol. 2023;5(2):58-64. Available from: https://pubmed.ncbi.nlm.nih.gov/38505730/</w:t>
+      <w:bookmarkStart w:id="56" w:name="ref-Okayama2017"/>
+      <w:bookmarkEnd w:id="55"/>
+      <w:r>
+        <w:t>27. Shirakawa Y. Perioperative team cooperation at Okayama University Hospital [in Japanese]. Nihon Geka Gakkai Zasshi. 2017;118(2):149-54.</w:t>
       </w:r>
     </w:p>
     <w:p>
       <w:pPr>
         <w:pStyle w:val="a9"/>
       </w:pPr>
-      <w:bookmarkStart w:id="49" w:name="ref-MHLW_DentistSurvey2022"/>
-      <w:bookmarkEnd w:id="48"/>
-      <w:r>
-        <w:t>19. Ministry of Health, Labour and Welfare. Survey of physicians, dentists and pharmacists: Reiwa 4 (2022). 2023. Available from: https://www.mhlw.go.jp/toukei/saikin/hw/ishi/22/index.html</w:t>
+      <w:bookmarkStart w:id="57" w:name="ref-Kunitomi2025"/>
+      <w:bookmarkEnd w:id="56"/>
+      <w:r>
+        <w:t>28. Kunitomi T, Miyagami T, Teranaka S, Matsumoto T, Yoshimatsu Y, Matsumoto S, et al. Current state and challenges of dental intervention in aspiration pneumonia management from the perspective of hospitalists: A cross-sectional survey in Japan. Int J Gen Med. 2025;18:6889-98.</w:t>
       </w:r>
     </w:p>
     <w:p>
       <w:pPr>
         <w:pStyle w:val="a9"/>
       </w:pPr>
-      <w:bookmarkStart w:id="50" w:name="ref-Anselin1995"/>
-      <w:bookmarkEnd w:id="49"/>
-      <w:r>
-        <w:t>20. Anselin L. Spatial econometrics: Methods and models. Dordrecht: Kluwer Academic Publishers; 1988.</w:t>
+      <w:bookmarkStart w:id="58" w:name="ref-Shirakura2024"/>
+      <w:bookmarkEnd w:id="57"/>
+      <w:r>
+        <w:t>29. Shirakura Y, Shobugawa Y, Saito R. Geographic variation in inpatient medical expenditure among older adults aged 75 years and above in Japan: A three-level multilevel analysis of nationwide data. Front Public Health. 2024;12:1306013.</w:t>
       </w:r>
     </w:p>
     <w:p>
       <w:pPr>
         <w:pStyle w:val="a9"/>
       </w:pPr>
-      <w:bookmarkStart w:id="51" w:name="ref-Anselin1988"/>
-      <w:bookmarkEnd w:id="50"/>
-      <w:r>
-        <w:t>21. LeSage JP, Pace RK. Introduction to spatial econometrics. Boca Raton: Chapman and Hall/CRC; 2009.</w:t>
+      <w:bookmarkStart w:id="59" w:name="ref-Takazawa2026"/>
+      <w:bookmarkEnd w:id="58"/>
+      <w:r>
+        <w:t>30. Takazawa I, Suzuki H, Sugimoto K, Kabasawa Y, Adachi N, Yoshida N. Survey on status of oral care practices and factors associated with confidence in oral care skills in ward nurses at an acute hospital in Japan. BMC Oral Health. 2026;26(1):469.</w:t>
       </w:r>
     </w:p>
     <w:p>
       <w:pPr>
         <w:pStyle w:val="a9"/>
       </w:pPr>
-      <w:bookmarkStart w:id="52" w:name="ref-LeSage2009"/>
-      <w:bookmarkEnd w:id="51"/>
-      <w:r>
-        <w:t>22. Anselin L. Local indicators of spatial association-LISA. Geogr Anal. 1995;27(2):93-115.</w:t>
+      <w:bookmarkStart w:id="60" w:name="ref-Koike2022"/>
+      <w:bookmarkEnd w:id="59"/>
+      <w:r>
+        <w:t>31. Koike T, Ohta R, Matsuda Y, Sano C, Kanno T. Oral care awareness and factors related to the burden of nurses at a community hospital in Japan. Healthcare (Basel). 2022;10(6):1073.</w:t>
       </w:r>
     </w:p>
     <w:p>
       <w:pPr>
         <w:pStyle w:val="a9"/>
       </w:pPr>
-      <w:bookmarkStart w:id="53" w:name="ref-Cohen1988"/>
-      <w:bookmarkEnd w:id="52"/>
-      <w:r>
-        <w:t>23. Cohen J. Statistical power analysis for the behavioral sciences. 2nd ed. Hillsdale (NJ): Lawrence Erlbaum Associates; 1988.</w:t>
+      <w:bookmarkStart w:id="61" w:name="ref-Hashimura2018"/>
+      <w:bookmarkEnd w:id="60"/>
+      <w:r>
+        <w:t>32. Hashimura T, Tanimoto T, Morita T, Kami M. Distribution of dentists in the greater Tokyo area, Japan. Int Dent J. 2019;69(2):150-7. Available from: https://pubmed.ncbi.nlm.nih.gov/30350864/</w:t>
       </w:r>
     </w:p>
     <w:p>
       <w:pPr>
         <w:pStyle w:val="a9"/>
       </w:pPr>
-      <w:bookmarkStart w:id="54" w:name="ref-Greenhalgh2004"/>
-      <w:bookmarkEnd w:id="53"/>
-      <w:r>
-        <w:t>24. Greenhalgh T, Robert G, Macfarlane F, Bate P, Kyriakidou O. Diffusion of innovations in service organizations: Systematic review and recommendations. Milbank Q. 2004;82(4):581-629.</w:t>
+      <w:bookmarkStart w:id="62" w:name="ref-Yamamoto2023access"/>
+      <w:bookmarkEnd w:id="61"/>
+      <w:r>
+        <w:t>33. Yamamoto T, Hanazato M, Hikichi H, Kondo K, Osaka K, Kawachi I, et al. Change in geographic accessibility to dental clinics affects access to care. J Dent Res. 2023;102(7):719-26. Available from: https://pubmed.ncbi.nlm.nih.gov/37204154/</w:t>
       </w:r>
     </w:p>
     <w:p>
       <w:pPr>
         <w:pStyle w:val="a9"/>
       </w:pPr>
-      <w:bookmarkStart w:id="55" w:name="ref-Ibuka2020"/>
-      <w:bookmarkEnd w:id="54"/>
+      <w:bookmarkStart w:id="63" w:name="ref-Sato2023dental"/>
+      <w:bookmarkEnd w:id="62"/>
       <w:r>
         <w:lastRenderedPageBreak/>
-        <w:t>25. Ibuka Y, Matsuda Y, Shoji K, Ishigaki T. Evaluation of regional variations in healthcare utilization. Jpn J Stat Data Sci. 2020;3(1):349-65.</w:t>
+        <w:t>34. Sato Y, Fukai K, Kunori Y, Yoshioka E, Saijo Y. Trends in dental expenditures in Japan with a universal health insurance system. PLoS One. 2023;18(10):e0292547.</w:t>
       </w:r>
     </w:p>
     <w:p>
       <w:pPr>
         <w:pStyle w:val="a9"/>
       </w:pPr>
-      <w:bookmarkStart w:id="56" w:name="ref-Seo2022"/>
-      <w:bookmarkEnd w:id="55"/>
-      <w:r>
-        <w:t>26. Seo Y, Takikawa T. Regional variation in national healthcare expenditure and health system performance in central cities and suburbs in Japan. Healthcare (Basel). 2022;10(6):968.</w:t>
+      <w:bookmarkStart w:id="64" w:name="ref-Morgenstern1998"/>
+      <w:bookmarkEnd w:id="63"/>
+      <w:r>
+        <w:t>35. Morgenstern H. Ecologic studies in epidemiology: Concepts, principles, and methods. Annu Rev Public Health. 1995;16:61-81. Available from: https://pubmed.ncbi.nlm.nih.gov/7639884/</w:t>
       </w:r>
     </w:p>
     <w:p>
       <w:pPr>
         <w:pStyle w:val="a9"/>
       </w:pPr>
-      <w:bookmarkStart w:id="57" w:name="ref-Okayama2017"/>
-      <w:bookmarkEnd w:id="56"/>
-      <w:r>
-        <w:t>27. Shirakawa Y. Perioperative team cooperation at Okayama University Hospital [in Japanese]. Nihon Geka Gakkai Zasshi. 2017;118(2):149-54.</w:t>
-      </w:r>
-    </w:p>
-    <w:p>
-      <w:pPr>
-        <w:pStyle w:val="a9"/>
-      </w:pPr>
-      <w:bookmarkStart w:id="58" w:name="ref-Kunitomi2025"/>
-      <w:bookmarkEnd w:id="57"/>
-      <w:r>
-        <w:t>28. Kunitomi T, Miyagami T, Teranaka S, Matsumoto T, Yoshimatsu Y, Matsumoto S, et al. Current state and challenges of dental intervention in aspiration pneumonia management from the perspective of hospitalists: A cross-sectional survey in Japan. Int J Gen Med. 2025;18:6889-98.</w:t>
-      </w:r>
-    </w:p>
-    <w:p>
-      <w:pPr>
-        <w:pStyle w:val="a9"/>
-      </w:pPr>
-      <w:bookmarkStart w:id="59" w:name="ref-Shirakura2024"/>
-      <w:bookmarkEnd w:id="58"/>
-      <w:r>
-        <w:t>29. Shirakura Y, Shobugawa Y, Saito R. Geographic variation in inpatient medical expenditure among older adults aged 75 years and above in Japan: A three-level multilevel analysis of nationwide data. Front Public Health. 2024;12:1306013.</w:t>
-      </w:r>
-    </w:p>
-    <w:p>
-      <w:pPr>
-        <w:pStyle w:val="a9"/>
-      </w:pPr>
-      <w:bookmarkStart w:id="60" w:name="ref-Takazawa2026"/>
-      <w:bookmarkEnd w:id="59"/>
-      <w:r>
-        <w:t>30. Takazawa I, Suzuki H, Sugimoto K, Kabasawa Y, Adachi N, Yoshida N. Survey on status of oral care practices and factors associated with confidence in oral care skills in ward nurses at an acute hospital in Japan. BMC Oral Health. 2026;26(1):469.</w:t>
-      </w:r>
-    </w:p>
-    <w:p>
-      <w:pPr>
-        <w:pStyle w:val="a9"/>
-      </w:pPr>
-      <w:bookmarkStart w:id="61" w:name="ref-Koike2022"/>
-      <w:bookmarkEnd w:id="60"/>
-      <w:r>
-        <w:t>31. Koike T, Ohta R, Matsuda Y, Sano C, Kanno T. Oral care awareness and factors related to the burden of nurses at a community hospital in Japan. Healthcare (Basel). 2022;10(6):1073.</w:t>
-      </w:r>
-    </w:p>
-    <w:p>
-      <w:pPr>
-        <w:pStyle w:val="a9"/>
-      </w:pPr>
-      <w:bookmarkStart w:id="62" w:name="ref-Hashimura2018"/>
-      <w:bookmarkEnd w:id="61"/>
-      <w:r>
-        <w:t>32. Hashimura T, Tanimoto T, Morita T, Kami M. Distribution of dentists in the greater Tokyo area, Japan. Int Dent J. 2019;69(2):150-7. Available from: https://pubmed.ncbi.nlm.nih.gov/30350864/</w:t>
-      </w:r>
-    </w:p>
-    <w:p>
-      <w:pPr>
-        <w:pStyle w:val="a9"/>
-      </w:pPr>
-      <w:bookmarkStart w:id="63" w:name="ref-Yamamoto2023access"/>
-      <w:bookmarkEnd w:id="62"/>
-      <w:r>
-        <w:t>33. Yamamoto T, Hanazato M, Hikichi H, Kondo K, Osaka K, Kawachi I, et al. Change in geographic accessibility to dental clinics affects access to care. J Dent Res. 2023;102(7):719-26. Available from: https://pubmed.ncbi.nlm.nih.gov/37204154/</w:t>
-      </w:r>
-    </w:p>
-    <w:p>
-      <w:pPr>
-        <w:pStyle w:val="a9"/>
-      </w:pPr>
-      <w:bookmarkStart w:id="64" w:name="ref-Sato2023dental"/>
-      <w:bookmarkEnd w:id="63"/>
-      <w:r>
-        <w:t>34. Sato Y, Fukai K, Kunori Y, Yoshioka E, Saijo Y. Trends in dental expenditures in Japan with a universal health insurance system. PLoS One. 2023;18(10):e0292547.</w:t>
-      </w:r>
-    </w:p>
-    <w:p>
-      <w:pPr>
-        <w:pStyle w:val="a9"/>
-      </w:pPr>
-      <w:bookmarkStart w:id="65" w:name="ref-Morgenstern1998"/>
+      <w:bookmarkStart w:id="65" w:name="ref-Greenland2001"/>
       <w:bookmarkEnd w:id="64"/>
       <w:r>
-        <w:t>35. Morgenstern H. Ecologic studies in epidemiology: Concepts, principles, and methods. Annu Rev Public Health. 1995;16:61-81. Available from: https://pubmed.ncbi.nlm.nih.gov/7639884/</w:t>
-      </w:r>
-    </w:p>
-    <w:p>
-      <w:pPr>
-        <w:pStyle w:val="a9"/>
-      </w:pPr>
-      <w:bookmarkStart w:id="66" w:name="ref-Greenland2001"/>
-      <w:bookmarkEnd w:id="65"/>
-      <w:r>
-        <w:lastRenderedPageBreak/>
         <w:t>36. Greenland S. Ecologic versus individual-level sources of bias in ecologic estimates of contextual health effects. Int J Epidemiol. 2001;30(6):1343-50. Available from: https://pubmed.ncbi.nlm.nih.gov/11821344/</w:t>
       </w:r>
     </w:p>
-    <w:bookmarkEnd w:id="35"/>
-    <w:bookmarkEnd w:id="66"/>
-    <w:p>
-      <w:r>
-        <w:pict w14:anchorId="6233C4C6">
+    <w:bookmarkEnd w:id="34"/>
+    <w:bookmarkEnd w:id="65"/>
+    <w:p>
+      <w:r>
+        <w:pict w14:anchorId="5A12D1C5">
           <v:rect id="_x0000_i1031" style="width:0;height:1.5pt" o:hralign="center" o:hrstd="t" o:hr="t"/>
         </w:pict>
       </w:r>
     </w:p>
-    <w:bookmarkEnd w:id="33"/>
+    <w:bookmarkEnd w:id="32"/>
     <w:p>
       <w:pPr>
         <w:pStyle w:val="1"/>
@@ -2316,7 +2277,7 @@
     </w:tbl>
     <w:p>
       <w:r>
-        <w:pict w14:anchorId="7710DC3C">
+        <w:pict w14:anchorId="1F0664AF">
           <v:rect id="_x0000_i1032" style="width:0;height:1.5pt" o:hralign="center" o:hrstd="t" o:hr="t"/>
         </w:pict>
       </w:r>
@@ -2647,7 +2608,7 @@
     </w:p>
     <w:p>
       <w:r>
-        <w:pict w14:anchorId="5CDDD0BF">
+        <w:pict w14:anchorId="5351598D">
           <v:rect id="_x0000_i1033" style="width:0;height:1.5pt" o:hralign="center" o:hrstd="t" o:hr="t"/>
         </w:pict>
       </w:r>
@@ -2657,6 +2618,7 @@
         <w:rPr>
           <w:b/>
         </w:rPr>
+        <w:lastRenderedPageBreak/>
         <w:t>Main Figures</w:t>
       </w:r>
     </w:p>
@@ -2665,7 +2627,7 @@
         <w:pStyle w:val="FirstParagraph"/>
       </w:pPr>
       <w:r>
-        <w:t>Figure 3: Prefectural distribution of perioperative oral management (POFM) density (B001-2 + B001-3 claim counts per 100,000 population, FY2023).</w:t>
+        <w:t>Figure 1: Prefectural distribution of perioperative oral management (POFM) density (B001-2 + B001-3 claim counts per 100,000 population, FY2023).</w:t>
       </w:r>
     </w:p>
     <w:p>
@@ -2676,9 +2638,8 @@
         <w:rPr>
           <w:noProof/>
         </w:rPr>
-        <w:lastRenderedPageBreak/>
         <w:drawing>
-          <wp:inline distT="0" distB="0" distL="0" distR="0" wp14:anchorId="449E1F68" wp14:editId="0127A177">
+          <wp:inline distT="0" distB="0" distL="0" distR="0" wp14:anchorId="72E5571A" wp14:editId="634B7B53">
             <wp:extent cx="4267200" cy="3606997"/>
             <wp:effectExtent l="0" t="0" r="0" b="0"/>
             <wp:docPr id="120" name="Picture" descr="Choropleth map of POFM density by prefecture"/>
@@ -2733,7 +2694,7 @@
         <w:pStyle w:val="a0"/>
       </w:pPr>
       <w:r>
-        <w:t>Figure 6: Local Indicators of Spatial Association (LISA) cluster map of POFM density across 47 Japanese prefectures (999 permutations, p &lt; 0.05). Red = High-High (HH, n=3); Blue = Low-Low (LL, n=3); Light blue = Low-High (LH, n=1); Grey = Not significant (n=40).</w:t>
+        <w:t>Figure 2: Local Indicators of Spatial Association (LISA) cluster map of POFM density across 47 Japanese prefectures (999 permutations, p &lt; 0.05). Red = High-High (HH, n=3); Blue = Low-Low (LL, n=3); Light blue = Low-High (LH, n=1); Grey = Not significant (n=40).</w:t>
       </w:r>
     </w:p>
     <w:p>
@@ -2746,7 +2707,7 @@
         </w:rPr>
         <w:lastRenderedPageBreak/>
         <w:drawing>
-          <wp:inline distT="0" distB="0" distL="0" distR="0" wp14:anchorId="686A0D0C" wp14:editId="478375C1">
+          <wp:inline distT="0" distB="0" distL="0" distR="0" wp14:anchorId="61C71B28" wp14:editId="2E69BEF9">
             <wp:extent cx="4267200" cy="4493895"/>
             <wp:effectExtent l="0" t="0" r="0" b="0"/>
             <wp:docPr id="132" name="Picture" descr="LISA cluster map of POFM density"/>
@@ -3258,7 +3219,6 @@
               <w:pStyle w:val="Compact"/>
             </w:pPr>
             <w:r>
-              <w:lastRenderedPageBreak/>
               <w:t>AIC</w:t>
             </w:r>
           </w:p>
@@ -3412,6 +3372,7 @@
         </w:tc>
       </w:tr>
     </w:tbl>
+    <w:p/>
     <w:sectPr>
       <w:footnotePr>
         <w:numRestart w:val="eachSect"/>
@@ -4134,6 +4095,7 @@
   <w:style w:type="character" w:default="1" w:styleId="a1">
     <w:name w:val="Default Paragraph Font"/>
     <w:uiPriority w:val="1"/>
+    <w:semiHidden/>
     <w:unhideWhenUsed/>
   </w:style>
   <w:style w:type="table" w:default="1" w:styleId="a2">

</xml_diff>

<commit_message>
fix: renumber Appendix Figures A4→A3, A5→A4 to eliminate gap (no A3)
Old Figure 3 became main Figure 1, leaving A3 vacant. Renumber appendix
figures sequentially: A1 (conceptual), A2 (dentist scatter), A3 (cancer
surgery scatter), A4 (forest plot); Supplementary Figure S1 unchanged.

Update all references in manuscript_main.docx and supplementary_material.docx.
Cover letter now states 'Appendix Figures A1–A4' without gaps.
Submission record and README updated to reflect supplementary_material.docx
as the single supplementary upload (replaces mislabeled individual PNGs).

Co-Authored-By: Claude Sonnet 4.6 <noreply@anthropic.com>
</commit_message>
<xml_diff>
--- a/04_Manuscripts/submission_package_JECP/manuscript_main.docx
+++ b/04_Manuscripts/submission_package_JECP/manuscript_main.docx
@@ -727,7 +727,7 @@
         <w:pStyle w:val="FirstParagraph"/>
       </w:pPr>
       <w:r>
-        <w:t>The scatter plot (Appendix Figure A4) shows no clear linear association between cancer surgery density and POFM density across prefectures.</w:t>
+        <w:t>The scatter plot (Appendix Figure A3) shows no clear linear association between cancer surgery density and POFM density across prefectures.</w:t>
       </w:r>
     </w:p>
     <w:p>
@@ -765,7 +765,7 @@
         <w:pStyle w:val="FirstParagraph"/>
       </w:pPr>
       <w:r>
-        <w:t>The forest plot (Appendix Figure A5) summarizes the cancer surgery density coefficient across seven sensitivity specifications. None of the seven specifications yielded a statistically significant association (p &lt; 0.05; 0/7 specifications significant). In Specification 7 (adjusted additionally for dentist density), cancer surgery density remained non-significant (p &gt; 0.05), while the inclusion of dentist density did not materially alter other model estimates.</w:t>
+        <w:t>The forest plot (Appendix Figure A4) summarizes the cancer surgery density coefficient across seven sensitivity specifications. None of the seven specifications yielded a statistically significant association (p &lt; 0.05; 0/7 specifications significant). In Specification 7 (adjusted additionally for dentist density), cancer surgery density remained non-significant (p &gt; 0.05), while the inclusion of dentist density did not materially alter other model estimates.</w:t>
       </w:r>
       <w:r>
         <w:rPr>

</xml_diff>

<commit_message>
fix: address JECP editorial return 2340680 (2026-06-25)
Editorial office returned manuscript to draft with two required corrections:
1. Add author names, affiliations, and corresponding author email within main document
   - Added after Running title: author line, affiliations (2), corresponding author block
2. Expand funding statement from 'None declared.' to Wiley standard sentence:
   'The author(s) received no financial support for the research, authorship,
   and/or publication of this article.'

Co-Authored-By: Claude Sonnet 4.6 <noreply@anthropic.com>
</commit_message>
<xml_diff>
--- a/04_Manuscripts/submission_package_JECP/manuscript_main.docx
+++ b/04_Manuscripts/submission_package_JECP/manuscript_main.docx
@@ -26,6 +26,30 @@
         <w:t>Running title: Perioperative Oral Care Under Universal Coverage</w:t>
       </w:r>
     </w:p>
+    <w:p/>
+    <w:p>
+      <w:r>
+        <w:t>Haruki Saito,¹ Tetsuya Ohira¹²</w:t>
+      </w:r>
+    </w:p>
+    <w:p/>
+    <w:p>
+      <w:r>
+        <w:t>¹ Department of Epidemiology, Fukushima Medical University School of Medicine, 1 Hikarigaoka, Fukushima-shi, Fukushima 960-1295, Japan</w:t>
+      </w:r>
+    </w:p>
+    <w:p>
+      <w:r>
+        <w:t>² Radiation Medical Science Center for the Fukushima Health Management Survey, Fukushima Medical University, Fukushima, Japan</w:t>
+      </w:r>
+    </w:p>
+    <w:p/>
+    <w:p>
+      <w:r>
+        <w:t>Corresponding author: Haruki Saito, Department of Epidemiology, Fukushima Medical University School of Medicine, 1 Hikarigaoka, Fukushima-shi, Fukushima 960-1295, Japan. Email: m211039@fmu.ac.jp</w:t>
+      </w:r>
+    </w:p>
+    <w:p/>
     <w:p/>
     <w:p>
       <w:pPr>
@@ -1352,7 +1376,7 @@
         </w:rPr>
       </w:pPr>
       <w:r>
-        <w:t>None declared.</w:t>
+        <w:t>The author(s) received no financial support for the research, authorship, and/or publication of this article.</w:t>
       </w:r>
     </w:p>
     <w:p>

</xml_diff>